<commit_message>
updated co3 co4 files
</commit_message>
<xml_diff>
--- a/Docs/CO3-assesment ishtyaq.docx
+++ b/Docs/CO3-assesment ishtyaq.docx
@@ -1,6 +1,6 @@
 
 <file path=word/document.xml><?xml version="1.0" encoding="utf-8"?>
-<w:document xmlns:o="urn:schemas-microsoft-com:office:office" xmlns:r="http://schemas.openxmlformats.org/officeDocument/2006/relationships" xmlns:v="urn:schemas-microsoft-com:vml" xmlns:w="http://schemas.openxmlformats.org/wordprocessingml/2006/main" xmlns:w10="urn:schemas-microsoft-com:office:word" xmlns:wp="http://schemas.openxmlformats.org/drawingml/2006/wordprocessingDrawing" xmlns:wps="http://schemas.microsoft.com/office/word/2010/wordprocessingShape" xmlns:wpg="http://schemas.microsoft.com/office/word/2010/wordprocessingGroup" xmlns:mc="http://schemas.openxmlformats.org/markup-compatibility/2006" xmlns:wp14="http://schemas.microsoft.com/office/word/2010/wordprocessingDrawing" xmlns:w14="http://schemas.microsoft.com/office/word/2010/wordml" xmlns:w15="http://schemas.microsoft.com/office/word/2012/wordml" mc:Ignorable="w14 wp14 w15">
+<w:document xmlns:o="urn:schemas-microsoft-com:office:office" xmlns:r="http://schemas.openxmlformats.org/officeDocument/2006/relationships" xmlns:v="urn:schemas-microsoft-com:vml" xmlns:w="http://schemas.openxmlformats.org/wordprocessingml/2006/main" xmlns:w10="urn:schemas-microsoft-com:office:word" xmlns:wp="http://schemas.openxmlformats.org/drawingml/2006/wordprocessingDrawing" xmlns:wps="http://schemas.microsoft.com/office/word/2010/wordprocessingShape" xmlns:wpg="http://schemas.microsoft.com/office/word/2010/wordprocessingGroup" xmlns:mc="http://schemas.openxmlformats.org/markup-compatibility/2006" xmlns:wp14="http://schemas.microsoft.com/office/word/2010/wordprocessingDrawing" xmlns:w14="http://schemas.microsoft.com/office/word/2010/wordml" xmlns:w15="http://schemas.microsoft.com/office/word/2012/wordml" xmlns:a="http://schemas.openxmlformats.org/drawingml/2006/main" xmlns:pic="http://schemas.openxmlformats.org/drawingml/2006/picture" xmlns:a14="http://schemas.microsoft.com/office/drawing/2010/main" mc:Ignorable="w14 wp14 w15">
   <w:body>
     <w:tbl>
       <w:tblPr>
@@ -14,13 +14,13 @@
           <w:bottom w:w="45" w:type="dxa"/>
           <w:right w:w="110" w:type="dxa"/>
         </w:tblCellMar>
-        <w:tblLook w:val="04a0" w:noHBand="0" w:noVBand="1" w:firstColumn="1" w:lastRow="0" w:lastColumn="0" w:firstRow="1"/>
+        <w:tblLook w:val="04a0" w:firstRow="1" w:lastRow="0" w:firstColumn="1" w:lastColumn="0" w:noHBand="0" w:noVBand="1"/>
       </w:tblPr>
       <w:tblGrid>
         <w:gridCol w:w="7781"/>
         <w:gridCol w:w="3450"/>
       </w:tblGrid>
-      <w:tr>
+      <w:tr xmlns:wp14="http://schemas.microsoft.com/office/word/2010/wordml" wp14:textId="77777777">
         <w:trPr>
           <w:trHeight w:val="600" w:hRule="exact"/>
         </w:trPr>
@@ -28,10 +28,10 @@
           <w:tcPr>
             <w:tcW w:w="7781" w:type="dxa"/>
             <w:tcBorders/>
-            <w:shd w:color="auto" w:fill="123152" w:val="clear"/>
+            <w:shd w:val="clear" w:color="auto" w:fill="123152"/>
             <w:vAlign w:val="center"/>
           </w:tcPr>
-          <w:p>
+          <w:p wp14:textId="77777777">
             <w:pPr>
               <w:pStyle w:val="Normal"/>
               <w:jc w:val="center"/>
@@ -51,17 +51,17 @@
           <w:tcPr>
             <w:tcW w:w="3450" w:type="dxa"/>
             <w:tcBorders/>
-            <w:shd w:color="auto" w:fill="123152" w:val="clear"/>
+            <w:shd w:val="clear" w:color="auto" w:fill="123152"/>
             <w:vAlign w:val="center"/>
           </w:tcPr>
-          <w:p>
+          <w:p wp14:textId="77777777">
             <w:pPr>
               <w:pStyle w:val="Normal"/>
               <w:jc w:val="center"/>
               <w:rPr>
                 <w:b/>
                 <w:bCs/>
-                <w:color w:themeColor="background1" w:val="FFFFFF"/>
+                <w:color w:val="FFFFFF" w:themeColor="background1"/>
                 <w:sz w:val="27"/>
                 <w:szCs w:val="27"/>
               </w:rPr>
@@ -70,7 +70,7 @@
               <w:rPr>
                 <w:b/>
                 <w:bCs/>
-                <w:color w:themeColor="background1" w:val="FFFFFF"/>
+                <w:color w:val="FFFFFF" w:themeColor="background1"/>
                 <w:sz w:val="27"/>
                 <w:szCs w:val="27"/>
               </w:rPr>
@@ -80,7 +80,7 @@
               <w:rPr>
                 <w:b/>
                 <w:bCs/>
-                <w:color w:themeColor="background1" w:val="FFFFFF"/>
+                <w:color w:val="FFFFFF" w:themeColor="background1"/>
                 <w:sz w:val="27"/>
                 <w:szCs w:val="27"/>
                 <w:lang w:val="en-GB"/>
@@ -90,7 +90,7 @@
           </w:p>
         </w:tc>
       </w:tr>
-      <w:tr>
+      <w:tr xmlns:wp14="http://schemas.microsoft.com/office/word/2010/wordml" wp14:textId="77777777">
         <w:trPr>
           <w:trHeight w:val="60" w:hRule="exact"/>
         </w:trPr>
@@ -99,7 +99,7 @@
             <w:tcW w:w="11231" w:type="dxa"/>
             <w:gridSpan w:val="2"/>
             <w:tcBorders/>
-            <w:shd w:color="auto" w:fill="DDAA3E" w:val="clear"/>
+            <w:shd w:val="clear" w:color="auto" w:fill="DDAA3E"/>
             <w:tcMar>
               <w:top w:w="0" w:type="dxa"/>
               <w:left w:w="0" w:type="dxa"/>
@@ -108,7 +108,7 @@
             </w:tcMar>
             <w:vAlign w:val="center"/>
           </w:tcPr>
-          <w:p>
+          <w:p wp14:textId="77777777">
             <w:pPr>
               <w:pStyle w:val="Normal"/>
               <w:jc w:val="center"/>
@@ -121,7 +121,7 @@
         </w:tc>
       </w:tr>
     </w:tbl>
-    <w:p>
+    <w:p xmlns:wp14="http://schemas.microsoft.com/office/word/2010/wordml" wp14:textId="77777777">
       <w:pPr>
         <w:pStyle w:val="Normal"/>
         <w:spacing w:before="80" w:after="40"/>
@@ -130,7 +130,7 @@
       </w:pPr>
       <w:r>
         <w:rPr>
-          <w:rFonts w:eastAsia="Aptos" w:ascii="Aptos" w:hAnsi="Aptos"/>
+          <w:rFonts w:ascii="Aptos" w:hAnsi="Aptos" w:eastAsia="Aptos"/>
           <w:b/>
           <w:color w:val="183A63"/>
           <w:sz w:val="27"/>
@@ -138,7 +138,7 @@
         <w:t>INDIVIDUAL PROJECT ASSESSMENT  |  WEB TECHNOLOGIES</w:t>
       </w:r>
     </w:p>
-    <w:p>
+    <w:p xmlns:wp14="http://schemas.microsoft.com/office/word/2010/wordml" wp14:textId="77777777">
       <w:pPr>
         <w:pStyle w:val="Normal"/>
         <w:spacing w:before="0" w:after="80"/>
@@ -165,7 +165,7 @@
           <w:bottom w:w="32" w:type="dxa"/>
           <w:right w:w="55" w:type="dxa"/>
         </w:tblCellMar>
-        <w:tblLook w:val="04a0" w:noHBand="0" w:noVBand="1" w:firstColumn="1" w:lastRow="0" w:lastColumn="0" w:firstRow="1"/>
+        <w:tblLook w:val="04a0" w:firstRow="1" w:lastRow="0" w:firstColumn="1" w:lastColumn="0" w:noHBand="0" w:noVBand="1"/>
       </w:tblPr>
       <w:tblGrid>
         <w:gridCol w:w="862"/>
@@ -177,7 +177,7 @@
         <w:gridCol w:w="993"/>
         <w:gridCol w:w="1164"/>
       </w:tblGrid>
-      <w:tr>
+      <w:tr xmlns:wp14="http://schemas.microsoft.com/office/word/2010/wordml" wp14:textId="77777777">
         <w:trPr>
           <w:trHeight w:val="389" w:hRule="exact"/>
         </w:trPr>
@@ -185,15 +185,15 @@
           <w:tcPr>
             <w:tcW w:w="862" w:type="dxa"/>
             <w:tcBorders>
-              <w:top w:val="single" w:sz="4" w:space="0" w:color="D7E0EA"/>
-              <w:left w:val="single" w:sz="4" w:space="0" w:color="D7E0EA"/>
-              <w:bottom w:val="single" w:sz="4" w:space="0" w:color="D7E0EA"/>
-              <w:right w:val="single" w:sz="4" w:space="0" w:color="D7E0EA"/>
+              <w:top w:val="single" w:color="D7E0EA" w:sz="4" w:space="0"/>
+              <w:left w:val="single" w:color="D7E0EA" w:sz="4" w:space="0"/>
+              <w:bottom w:val="single" w:color="D7E0EA" w:sz="4" w:space="0"/>
+              <w:right w:val="single" w:color="D7E0EA" w:sz="4" w:space="0"/>
             </w:tcBorders>
-            <w:shd w:color="auto" w:fill="EAF2F8" w:val="clear"/>
+            <w:shd w:val="clear" w:color="auto" w:fill="EAF2F8"/>
             <w:vAlign w:val="center"/>
           </w:tcPr>
-          <w:p>
+          <w:p wp14:textId="77777777">
             <w:pPr>
               <w:pStyle w:val="Normal"/>
               <w:rPr/>
@@ -212,14 +212,14 @@
           <w:tcPr>
             <w:tcW w:w="3315" w:type="dxa"/>
             <w:tcBorders>
-              <w:top w:val="single" w:sz="4" w:space="0" w:color="D7E0EA"/>
-              <w:left w:val="single" w:sz="4" w:space="0" w:color="D7E0EA"/>
-              <w:bottom w:val="single" w:sz="4" w:space="0" w:color="D7E0EA"/>
-              <w:right w:val="single" w:sz="4" w:space="0" w:color="D7E0EA"/>
+              <w:top w:val="single" w:color="D7E0EA" w:sz="4" w:space="0"/>
+              <w:left w:val="single" w:color="D7E0EA" w:sz="4" w:space="0"/>
+              <w:bottom w:val="single" w:color="D7E0EA" w:sz="4" w:space="0"/>
+              <w:right w:val="single" w:color="D7E0EA" w:sz="4" w:space="0"/>
             </w:tcBorders>
             <w:vAlign w:val="center"/>
           </w:tcPr>
-          <w:p>
+          <w:p wp14:textId="77777777">
             <w:pPr>
               <w:pStyle w:val="Normal"/>
               <w:rPr>
@@ -238,15 +238,15 @@
           <w:tcPr>
             <w:tcW w:w="1123" w:type="dxa"/>
             <w:tcBorders>
-              <w:top w:val="single" w:sz="4" w:space="0" w:color="D7E0EA"/>
-              <w:left w:val="single" w:sz="4" w:space="0" w:color="D7E0EA"/>
-              <w:bottom w:val="single" w:sz="4" w:space="0" w:color="D7E0EA"/>
-              <w:right w:val="single" w:sz="4" w:space="0" w:color="D7E0EA"/>
+              <w:top w:val="single" w:color="D7E0EA" w:sz="4" w:space="0"/>
+              <w:left w:val="single" w:color="D7E0EA" w:sz="4" w:space="0"/>
+              <w:bottom w:val="single" w:color="D7E0EA" w:sz="4" w:space="0"/>
+              <w:right w:val="single" w:color="D7E0EA" w:sz="4" w:space="0"/>
             </w:tcBorders>
-            <w:shd w:color="auto" w:fill="EAF2F8" w:val="clear"/>
+            <w:shd w:val="clear" w:color="auto" w:fill="EAF2F8"/>
             <w:vAlign w:val="center"/>
           </w:tcPr>
-          <w:p>
+          <w:p wp14:textId="77777777">
             <w:pPr>
               <w:pStyle w:val="Normal"/>
               <w:rPr/>
@@ -265,15 +265,15 @@
           <w:tcPr>
             <w:tcW w:w="1698" w:type="dxa"/>
             <w:tcBorders>
-              <w:top w:val="single" w:sz="4" w:space="0" w:color="D7E0EA"/>
-              <w:left w:val="single" w:sz="4" w:space="0" w:color="D7E0EA"/>
-              <w:bottom w:val="single" w:sz="4" w:space="0" w:color="D7E0EA"/>
-              <w:right w:val="single" w:sz="4" w:space="0" w:color="D7E0EA"/>
+              <w:top w:val="single" w:color="D7E0EA" w:sz="4" w:space="0"/>
+              <w:left w:val="single" w:color="D7E0EA" w:sz="4" w:space="0"/>
+              <w:bottom w:val="single" w:color="D7E0EA" w:sz="4" w:space="0"/>
+              <w:right w:val="single" w:color="D7E0EA" w:sz="4" w:space="0"/>
             </w:tcBorders>
-            <w:shd w:color="auto" w:fill="EAF3F8" w:val="clear"/>
+            <w:shd w:val="clear" w:color="auto" w:fill="EAF3F8"/>
             <w:vAlign w:val="center"/>
           </w:tcPr>
-          <w:p>
+          <w:p wp14:textId="77777777">
             <w:pPr>
               <w:pStyle w:val="Normal"/>
               <w:jc w:val="center"/>
@@ -293,15 +293,15 @@
           <w:tcPr>
             <w:tcW w:w="793" w:type="dxa"/>
             <w:tcBorders>
-              <w:top w:val="single" w:sz="4" w:space="0" w:color="D7E0EA"/>
-              <w:left w:val="single" w:sz="4" w:space="0" w:color="D7E0EA"/>
-              <w:bottom w:val="single" w:sz="4" w:space="0" w:color="D7E0EA"/>
-              <w:right w:val="single" w:sz="4" w:space="0" w:color="D7E0EA"/>
+              <w:top w:val="single" w:color="D7E0EA" w:sz="4" w:space="0"/>
+              <w:left w:val="single" w:color="D7E0EA" w:sz="4" w:space="0"/>
+              <w:bottom w:val="single" w:color="D7E0EA" w:sz="4" w:space="0"/>
+              <w:right w:val="single" w:color="D7E0EA" w:sz="4" w:space="0"/>
             </w:tcBorders>
-            <w:shd w:color="auto" w:fill="EAF2F8" w:val="clear"/>
+            <w:shd w:val="clear" w:color="auto" w:fill="EAF2F8"/>
             <w:vAlign w:val="center"/>
           </w:tcPr>
-          <w:p>
+          <w:p wp14:textId="77777777">
             <w:pPr>
               <w:pStyle w:val="Normal"/>
               <w:rPr/>
@@ -320,14 +320,14 @@
           <w:tcPr>
             <w:tcW w:w="1282" w:type="dxa"/>
             <w:tcBorders>
-              <w:top w:val="single" w:sz="4" w:space="0" w:color="D7E0EA"/>
-              <w:left w:val="single" w:sz="4" w:space="0" w:color="D7E0EA"/>
-              <w:bottom w:val="single" w:sz="4" w:space="0" w:color="D7E0EA"/>
-              <w:right w:val="single" w:sz="4" w:space="0" w:color="D7E0EA"/>
+              <w:top w:val="single" w:color="D7E0EA" w:sz="4" w:space="0"/>
+              <w:left w:val="single" w:color="D7E0EA" w:sz="4" w:space="0"/>
+              <w:bottom w:val="single" w:color="D7E0EA" w:sz="4" w:space="0"/>
+              <w:right w:val="single" w:color="D7E0EA" w:sz="4" w:space="0"/>
             </w:tcBorders>
             <w:vAlign w:val="center"/>
           </w:tcPr>
-          <w:p>
+          <w:p wp14:textId="77777777">
             <w:pPr>
               <w:pStyle w:val="Normal"/>
               <w:jc w:val="center"/>
@@ -343,12 +343,12 @@
           <w:tcPr>
             <w:tcW w:w="993" w:type="dxa"/>
             <w:tcBorders>
-              <w:top w:val="single" w:sz="4" w:space="0" w:color="D7E0EA"/>
-              <w:left w:val="single" w:sz="4" w:space="0" w:color="D7E0EA"/>
-              <w:bottom w:val="single" w:sz="4" w:space="0" w:color="D7E0EA"/>
-              <w:right w:val="single" w:sz="4" w:space="0" w:color="D7E0EA"/>
+              <w:top w:val="single" w:color="D7E0EA" w:sz="4" w:space="0"/>
+              <w:left w:val="single" w:color="D7E0EA" w:sz="4" w:space="0"/>
+              <w:bottom w:val="single" w:color="D7E0EA" w:sz="4" w:space="0"/>
+              <w:right w:val="single" w:color="D7E0EA" w:sz="4" w:space="0"/>
             </w:tcBorders>
-            <w:shd w:color="auto" w:fill="EAF3F8" w:val="clear"/>
+            <w:shd w:val="clear" w:color="auto" w:fill="EAF3F8"/>
             <w:tcMar>
               <w:top w:w="0" w:type="dxa"/>
               <w:left w:w="108" w:type="dxa"/>
@@ -357,7 +357,7 @@
             </w:tcMar>
             <w:vAlign w:val="center"/>
           </w:tcPr>
-          <w:p>
+          <w:p wp14:textId="77777777">
             <w:pPr>
               <w:pStyle w:val="Normal"/>
               <w:rPr>
@@ -383,10 +383,10 @@
           <w:tcPr>
             <w:tcW w:w="1164" w:type="dxa"/>
             <w:tcBorders>
-              <w:top w:val="single" w:sz="4" w:space="0" w:color="D7E0EA"/>
-              <w:left w:val="single" w:sz="4" w:space="0" w:color="D7E0EA"/>
-              <w:bottom w:val="single" w:sz="4" w:space="0" w:color="D7E0EA"/>
-              <w:right w:val="single" w:sz="4" w:space="0" w:color="D7E0EA"/>
+              <w:top w:val="single" w:color="D7E0EA" w:sz="4" w:space="0"/>
+              <w:left w:val="single" w:color="D7E0EA" w:sz="4" w:space="0"/>
+              <w:bottom w:val="single" w:color="D7E0EA" w:sz="4" w:space="0"/>
+              <w:right w:val="single" w:color="D7E0EA" w:sz="4" w:space="0"/>
             </w:tcBorders>
             <w:tcMar>
               <w:top w:w="0" w:type="dxa"/>
@@ -396,7 +396,7 @@
             </w:tcMar>
             <w:vAlign w:val="center"/>
           </w:tcPr>
-          <w:p>
+          <w:p wp14:textId="77777777">
             <w:pPr>
               <w:pStyle w:val="Normal"/>
               <w:jc w:val="center"/>
@@ -409,7 +409,7 @@
           </w:p>
         </w:tc>
       </w:tr>
-      <w:tr>
+      <w:tr xmlns:wp14="http://schemas.microsoft.com/office/word/2010/wordml" wp14:textId="77777777">
         <w:trPr>
           <w:trHeight w:val="367" w:hRule="exact"/>
         </w:trPr>
@@ -417,15 +417,15 @@
           <w:tcPr>
             <w:tcW w:w="862" w:type="dxa"/>
             <w:tcBorders>
-              <w:top w:val="single" w:sz="4" w:space="0" w:color="D7E0EA"/>
-              <w:left w:val="single" w:sz="4" w:space="0" w:color="D7E0EA"/>
-              <w:bottom w:val="single" w:sz="4" w:space="0" w:color="D7E0EA"/>
-              <w:right w:val="single" w:sz="4" w:space="0" w:color="D7E0EA"/>
+              <w:top w:val="single" w:color="D7E0EA" w:sz="4" w:space="0"/>
+              <w:left w:val="single" w:color="D7E0EA" w:sz="4" w:space="0"/>
+              <w:bottom w:val="single" w:color="D7E0EA" w:sz="4" w:space="0"/>
+              <w:right w:val="single" w:color="D7E0EA" w:sz="4" w:space="0"/>
             </w:tcBorders>
-            <w:shd w:color="auto" w:fill="EAF2F8" w:val="clear"/>
+            <w:shd w:val="clear" w:color="auto" w:fill="EAF2F8"/>
             <w:vAlign w:val="center"/>
           </w:tcPr>
-          <w:p>
+          <w:p wp14:textId="77777777">
             <w:pPr>
               <w:pStyle w:val="Normal"/>
               <w:rPr/>
@@ -445,14 +445,14 @@
             <w:tcW w:w="10368" w:type="dxa"/>
             <w:gridSpan w:val="7"/>
             <w:tcBorders>
-              <w:top w:val="single" w:sz="4" w:space="0" w:color="D7E0EA"/>
-              <w:left w:val="single" w:sz="4" w:space="0" w:color="D7E0EA"/>
-              <w:bottom w:val="single" w:sz="4" w:space="0" w:color="D7E0EA"/>
-              <w:right w:val="single" w:sz="4" w:space="0" w:color="D7E0EA"/>
+              <w:top w:val="single" w:color="D7E0EA" w:sz="4" w:space="0"/>
+              <w:left w:val="single" w:color="D7E0EA" w:sz="4" w:space="0"/>
+              <w:bottom w:val="single" w:color="D7E0EA" w:sz="4" w:space="0"/>
+              <w:right w:val="single" w:color="D7E0EA" w:sz="4" w:space="0"/>
             </w:tcBorders>
             <w:vAlign w:val="center"/>
           </w:tcPr>
-          <w:p>
+          <w:p wp14:textId="77777777">
             <w:pPr>
               <w:pStyle w:val="Normal"/>
               <w:rPr/>
@@ -469,7 +469,7 @@
         </w:tc>
       </w:tr>
     </w:tbl>
-    <w:p>
+    <w:p xmlns:wp14="http://schemas.microsoft.com/office/word/2010/wordml" wp14:textId="77777777">
       <w:pPr>
         <w:pStyle w:val="Normal"/>
         <w:keepNext w:val="true"/>
@@ -498,7 +498,7 @@
           <w:bottom w:w="0" w:type="dxa"/>
           <w:right w:w="108" w:type="dxa"/>
         </w:tblCellMar>
-        <w:tblLook w:val="04a0" w:noHBand="0" w:noVBand="1" w:firstColumn="1" w:lastRow="0" w:lastColumn="0" w:firstRow="1"/>
+        <w:tblLook w:val="04a0" w:firstRow="1" w:lastRow="0" w:firstColumn="1" w:lastColumn="0" w:noHBand="0" w:noVBand="1"/>
       </w:tblPr>
       <w:tblGrid>
         <w:gridCol w:w="1123"/>
@@ -513,22 +513,22 @@
         <w:gridCol w:w="1122"/>
         <w:gridCol w:w="1125"/>
       </w:tblGrid>
-      <w:tr>
+      <w:tr xmlns:wp14="http://schemas.microsoft.com/office/word/2010/wordml" wp14:textId="77777777">
         <w:trPr/>
         <w:tc>
           <w:tcPr>
             <w:tcW w:w="11231" w:type="dxa"/>
             <w:gridSpan w:val="11"/>
             <w:tcBorders>
-              <w:top w:val="single" w:sz="4" w:space="0" w:color="000000"/>
-              <w:left w:val="single" w:sz="4" w:space="0" w:color="000000"/>
-              <w:bottom w:val="single" w:sz="4" w:space="0" w:color="000000"/>
-              <w:right w:val="single" w:sz="4" w:space="0" w:color="000000"/>
+              <w:top w:val="single" w:color="000000" w:sz="4" w:space="0"/>
+              <w:left w:val="single" w:color="000000" w:sz="4" w:space="0"/>
+              <w:bottom w:val="single" w:color="000000" w:sz="4" w:space="0"/>
+              <w:right w:val="single" w:color="000000" w:sz="4" w:space="0"/>
             </w:tcBorders>
-            <w:shd w:color="auto" w:fill="17365D" w:val="clear"/>
+            <w:shd w:val="clear" w:color="auto" w:fill="17365D"/>
             <w:vAlign w:val="center"/>
           </w:tcPr>
-          <w:p>
+          <w:p wp14:textId="77777777">
             <w:pPr>
               <w:pStyle w:val="Normal"/>
               <w:jc w:val="center"/>
@@ -545,22 +545,22 @@
           </w:p>
         </w:tc>
       </w:tr>
-      <w:tr>
+      <w:tr xmlns:wp14="http://schemas.microsoft.com/office/word/2010/wordml" wp14:textId="77777777">
         <w:trPr/>
         <w:tc>
           <w:tcPr>
             <w:tcW w:w="4491" w:type="dxa"/>
             <w:gridSpan w:val="4"/>
             <w:tcBorders>
-              <w:top w:val="single" w:sz="4" w:space="0" w:color="000000"/>
-              <w:left w:val="single" w:sz="4" w:space="0" w:color="000000"/>
-              <w:bottom w:val="single" w:sz="4" w:space="0" w:color="000000"/>
-              <w:right w:val="single" w:sz="4" w:space="0" w:color="000000"/>
+              <w:top w:val="single" w:color="000000" w:sz="4" w:space="0"/>
+              <w:left w:val="single" w:color="000000" w:sz="4" w:space="0"/>
+              <w:bottom w:val="single" w:color="000000" w:sz="4" w:space="0"/>
+              <w:right w:val="single" w:color="000000" w:sz="4" w:space="0"/>
             </w:tcBorders>
-            <w:shd w:color="auto" w:fill="0F6B78" w:val="clear"/>
+            <w:shd w:val="clear" w:color="auto" w:fill="0F6B78"/>
             <w:vAlign w:val="center"/>
           </w:tcPr>
-          <w:p>
+          <w:p wp14:textId="77777777">
             <w:pPr>
               <w:pStyle w:val="Normal"/>
               <w:jc w:val="center"/>
@@ -581,15 +581,15 @@
             <w:tcW w:w="3370" w:type="dxa"/>
             <w:gridSpan w:val="4"/>
             <w:tcBorders>
-              <w:top w:val="single" w:sz="4" w:space="0" w:color="000000"/>
-              <w:left w:val="single" w:sz="4" w:space="0" w:color="000000"/>
-              <w:bottom w:val="single" w:sz="4" w:space="0" w:color="000000"/>
-              <w:right w:val="single" w:sz="4" w:space="0" w:color="000000"/>
+              <w:top w:val="single" w:color="000000" w:sz="4" w:space="0"/>
+              <w:left w:val="single" w:color="000000" w:sz="4" w:space="0"/>
+              <w:bottom w:val="single" w:color="000000" w:sz="4" w:space="0"/>
+              <w:right w:val="single" w:color="000000" w:sz="4" w:space="0"/>
             </w:tcBorders>
-            <w:shd w:color="auto" w:fill="0F6B78" w:val="clear"/>
+            <w:shd w:val="clear" w:color="auto" w:fill="0F6B78"/>
             <w:vAlign w:val="center"/>
           </w:tcPr>
-          <w:p>
+          <w:p wp14:textId="77777777">
             <w:pPr>
               <w:pStyle w:val="Normal"/>
               <w:jc w:val="center"/>
@@ -610,15 +610,15 @@
             <w:tcW w:w="2245" w:type="dxa"/>
             <w:gridSpan w:val="2"/>
             <w:tcBorders>
-              <w:top w:val="single" w:sz="4" w:space="0" w:color="000000"/>
-              <w:left w:val="single" w:sz="4" w:space="0" w:color="000000"/>
-              <w:bottom w:val="single" w:sz="4" w:space="0" w:color="000000"/>
-              <w:right w:val="single" w:sz="4" w:space="0" w:color="000000"/>
+              <w:top w:val="single" w:color="000000" w:sz="4" w:space="0"/>
+              <w:left w:val="single" w:color="000000" w:sz="4" w:space="0"/>
+              <w:bottom w:val="single" w:color="000000" w:sz="4" w:space="0"/>
+              <w:right w:val="single" w:color="000000" w:sz="4" w:space="0"/>
             </w:tcBorders>
-            <w:shd w:color="auto" w:fill="0F6B78" w:val="clear"/>
+            <w:shd w:val="clear" w:color="auto" w:fill="0F6B78"/>
             <w:vAlign w:val="center"/>
           </w:tcPr>
-          <w:p>
+          <w:p wp14:textId="77777777">
             <w:pPr>
               <w:pStyle w:val="Normal"/>
               <w:jc w:val="center"/>
@@ -638,15 +638,15 @@
           <w:tcPr>
             <w:tcW w:w="1125" w:type="dxa"/>
             <w:tcBorders>
-              <w:top w:val="single" w:sz="4" w:space="0" w:color="000000"/>
-              <w:left w:val="single" w:sz="4" w:space="0" w:color="000000"/>
-              <w:bottom w:val="single" w:sz="4" w:space="0" w:color="000000"/>
-              <w:right w:val="single" w:sz="4" w:space="0" w:color="000000"/>
+              <w:top w:val="single" w:color="000000" w:sz="4" w:space="0"/>
+              <w:left w:val="single" w:color="000000" w:sz="4" w:space="0"/>
+              <w:bottom w:val="single" w:color="000000" w:sz="4" w:space="0"/>
+              <w:right w:val="single" w:color="000000" w:sz="4" w:space="0"/>
             </w:tcBorders>
-            <w:shd w:color="auto" w:fill="0F6B78" w:val="clear"/>
+            <w:shd w:val="clear" w:color="auto" w:fill="0F6B78"/>
             <w:vAlign w:val="center"/>
           </w:tcPr>
-          <w:p>
+          <w:p wp14:textId="77777777">
             <w:pPr>
               <w:pStyle w:val="Normal"/>
               <w:jc w:val="center"/>
@@ -663,21 +663,21 @@
           </w:p>
         </w:tc>
       </w:tr>
-      <w:tr>
+      <w:tr xmlns:wp14="http://schemas.microsoft.com/office/word/2010/wordml" wp14:textId="77777777">
         <w:trPr/>
         <w:tc>
           <w:tcPr>
             <w:tcW w:w="1123" w:type="dxa"/>
             <w:tcBorders>
-              <w:top w:val="single" w:sz="4" w:space="0" w:color="000000"/>
-              <w:left w:val="single" w:sz="4" w:space="0" w:color="000000"/>
-              <w:bottom w:val="single" w:sz="4" w:space="0" w:color="000000"/>
-              <w:right w:val="single" w:sz="4" w:space="0" w:color="000000"/>
+              <w:top w:val="single" w:color="000000" w:sz="4" w:space="0"/>
+              <w:left w:val="single" w:color="000000" w:sz="4" w:space="0"/>
+              <w:bottom w:val="single" w:color="000000" w:sz="4" w:space="0"/>
+              <w:right w:val="single" w:color="000000" w:sz="4" w:space="0"/>
             </w:tcBorders>
-            <w:shd w:color="auto" w:fill="DCE6F1" w:val="clear"/>
+            <w:shd w:val="clear" w:color="auto" w:fill="DCE6F1"/>
             <w:vAlign w:val="center"/>
           </w:tcPr>
-          <w:p>
+          <w:p wp14:textId="77777777">
             <w:pPr>
               <w:pStyle w:val="Normal"/>
               <w:jc w:val="center"/>
@@ -697,15 +697,15 @@
           <w:tcPr>
             <w:tcW w:w="1123" w:type="dxa"/>
             <w:tcBorders>
-              <w:top w:val="single" w:sz="4" w:space="0" w:color="000000"/>
-              <w:left w:val="single" w:sz="4" w:space="0" w:color="000000"/>
-              <w:bottom w:val="single" w:sz="4" w:space="0" w:color="000000"/>
-              <w:right w:val="single" w:sz="4" w:space="0" w:color="000000"/>
+              <w:top w:val="single" w:color="000000" w:sz="4" w:space="0"/>
+              <w:left w:val="single" w:color="000000" w:sz="4" w:space="0"/>
+              <w:bottom w:val="single" w:color="000000" w:sz="4" w:space="0"/>
+              <w:right w:val="single" w:color="000000" w:sz="4" w:space="0"/>
             </w:tcBorders>
-            <w:shd w:color="auto" w:fill="DCE6F1" w:val="clear"/>
+            <w:shd w:val="clear" w:color="auto" w:fill="DCE6F1"/>
             <w:vAlign w:val="center"/>
           </w:tcPr>
-          <w:p>
+          <w:p wp14:textId="77777777">
             <w:pPr>
               <w:pStyle w:val="Normal"/>
               <w:jc w:val="center"/>
@@ -725,15 +725,15 @@
           <w:tcPr>
             <w:tcW w:w="1123" w:type="dxa"/>
             <w:tcBorders>
-              <w:top w:val="single" w:sz="4" w:space="0" w:color="000000"/>
-              <w:left w:val="single" w:sz="4" w:space="0" w:color="000000"/>
-              <w:bottom w:val="single" w:sz="4" w:space="0" w:color="000000"/>
-              <w:right w:val="single" w:sz="4" w:space="0" w:color="000000"/>
+              <w:top w:val="single" w:color="000000" w:sz="4" w:space="0"/>
+              <w:left w:val="single" w:color="000000" w:sz="4" w:space="0"/>
+              <w:bottom w:val="single" w:color="000000" w:sz="4" w:space="0"/>
+              <w:right w:val="single" w:color="000000" w:sz="4" w:space="0"/>
             </w:tcBorders>
-            <w:shd w:color="auto" w:fill="DCE6F1" w:val="clear"/>
+            <w:shd w:val="clear" w:color="auto" w:fill="DCE6F1"/>
             <w:vAlign w:val="center"/>
           </w:tcPr>
-          <w:p>
+          <w:p wp14:textId="77777777">
             <w:pPr>
               <w:pStyle w:val="Normal"/>
               <w:jc w:val="center"/>
@@ -754,15 +754,15 @@
             <w:tcW w:w="1123" w:type="dxa"/>
             <w:gridSpan w:val="2"/>
             <w:tcBorders>
-              <w:top w:val="single" w:sz="4" w:space="0" w:color="000000"/>
-              <w:left w:val="single" w:sz="4" w:space="0" w:color="000000"/>
-              <w:bottom w:val="single" w:sz="4" w:space="0" w:color="000000"/>
-              <w:right w:val="single" w:sz="4" w:space="0" w:color="000000"/>
+              <w:top w:val="single" w:color="000000" w:sz="4" w:space="0"/>
+              <w:left w:val="single" w:color="000000" w:sz="4" w:space="0"/>
+              <w:bottom w:val="single" w:color="000000" w:sz="4" w:space="0"/>
+              <w:right w:val="single" w:color="000000" w:sz="4" w:space="0"/>
             </w:tcBorders>
-            <w:shd w:color="auto" w:fill="DCE6F1" w:val="clear"/>
+            <w:shd w:val="clear" w:color="auto" w:fill="DCE6F1"/>
             <w:vAlign w:val="center"/>
           </w:tcPr>
-          <w:p>
+          <w:p wp14:textId="77777777">
             <w:pPr>
               <w:pStyle w:val="Normal"/>
               <w:jc w:val="center"/>
@@ -775,7 +775,21 @@
                 <w:sz w:val="15"/>
               </w:rPr>
               <w:t>Marks</w:t>
+            </w:r>
+            <w:r>
+              <w:rPr>
+                <w:b/>
+                <w:color w:val="17365D"/>
+                <w:sz w:val="15"/>
+              </w:rPr>
               <w:br/>
+            </w:r>
+            <w:r>
+              <w:rPr>
+                <w:b/>
+                <w:color w:val="17365D"/>
+                <w:sz w:val="15"/>
+              </w:rPr>
               <w:t>(0-3)</w:t>
             </w:r>
           </w:p>
@@ -784,15 +798,15 @@
           <w:tcPr>
             <w:tcW w:w="1124" w:type="dxa"/>
             <w:tcBorders>
-              <w:top w:val="single" w:sz="4" w:space="0" w:color="000000"/>
-              <w:left w:val="single" w:sz="4" w:space="0" w:color="000000"/>
-              <w:bottom w:val="single" w:sz="4" w:space="0" w:color="000000"/>
-              <w:right w:val="single" w:sz="4" w:space="0" w:color="000000"/>
+              <w:top w:val="single" w:color="000000" w:sz="4" w:space="0"/>
+              <w:left w:val="single" w:color="000000" w:sz="4" w:space="0"/>
+              <w:bottom w:val="single" w:color="000000" w:sz="4" w:space="0"/>
+              <w:right w:val="single" w:color="000000" w:sz="4" w:space="0"/>
             </w:tcBorders>
-            <w:shd w:color="auto" w:fill="DCE6F1" w:val="clear"/>
+            <w:shd w:val="clear" w:color="auto" w:fill="DCE6F1"/>
             <w:vAlign w:val="center"/>
           </w:tcPr>
-          <w:p>
+          <w:p wp14:textId="77777777">
             <w:pPr>
               <w:pStyle w:val="Normal"/>
               <w:jc w:val="center"/>
@@ -812,15 +826,15 @@
           <w:tcPr>
             <w:tcW w:w="1122" w:type="dxa"/>
             <w:tcBorders>
-              <w:top w:val="single" w:sz="4" w:space="0" w:color="000000"/>
-              <w:left w:val="single" w:sz="4" w:space="0" w:color="000000"/>
-              <w:bottom w:val="single" w:sz="4" w:space="0" w:color="000000"/>
-              <w:right w:val="single" w:sz="4" w:space="0" w:color="000000"/>
+              <w:top w:val="single" w:color="000000" w:sz="4" w:space="0"/>
+              <w:left w:val="single" w:color="000000" w:sz="4" w:space="0"/>
+              <w:bottom w:val="single" w:color="000000" w:sz="4" w:space="0"/>
+              <w:right w:val="single" w:color="000000" w:sz="4" w:space="0"/>
             </w:tcBorders>
-            <w:shd w:color="auto" w:fill="DCE6F1" w:val="clear"/>
+            <w:shd w:val="clear" w:color="auto" w:fill="DCE6F1"/>
             <w:vAlign w:val="center"/>
           </w:tcPr>
-          <w:p>
+          <w:p wp14:textId="77777777">
             <w:pPr>
               <w:pStyle w:val="Normal"/>
               <w:jc w:val="center"/>
@@ -840,15 +854,15 @@
           <w:tcPr>
             <w:tcW w:w="1123" w:type="dxa"/>
             <w:tcBorders>
-              <w:top w:val="single" w:sz="4" w:space="0" w:color="000000"/>
-              <w:left w:val="single" w:sz="4" w:space="0" w:color="000000"/>
-              <w:bottom w:val="single" w:sz="4" w:space="0" w:color="000000"/>
-              <w:right w:val="single" w:sz="4" w:space="0" w:color="000000"/>
+              <w:top w:val="single" w:color="000000" w:sz="4" w:space="0"/>
+              <w:left w:val="single" w:color="000000" w:sz="4" w:space="0"/>
+              <w:bottom w:val="single" w:color="000000" w:sz="4" w:space="0"/>
+              <w:right w:val="single" w:color="000000" w:sz="4" w:space="0"/>
             </w:tcBorders>
-            <w:shd w:color="auto" w:fill="DCE6F1" w:val="clear"/>
+            <w:shd w:val="clear" w:color="auto" w:fill="DCE6F1"/>
             <w:vAlign w:val="center"/>
           </w:tcPr>
-          <w:p>
+          <w:p wp14:textId="77777777">
             <w:pPr>
               <w:pStyle w:val="Normal"/>
               <w:jc w:val="center"/>
@@ -861,7 +875,21 @@
                 <w:sz w:val="15"/>
               </w:rPr>
               <w:t>Marks</w:t>
+            </w:r>
+            <w:r>
+              <w:rPr>
+                <w:b/>
+                <w:color w:val="17365D"/>
+                <w:sz w:val="15"/>
+              </w:rPr>
               <w:br/>
+            </w:r>
+            <w:r>
+              <w:rPr>
+                <w:b/>
+                <w:color w:val="17365D"/>
+                <w:sz w:val="15"/>
+              </w:rPr>
               <w:t>(0-3)</w:t>
             </w:r>
           </w:p>
@@ -870,15 +898,15 @@
           <w:tcPr>
             <w:tcW w:w="1123" w:type="dxa"/>
             <w:tcBorders>
-              <w:top w:val="single" w:sz="4" w:space="0" w:color="000000"/>
-              <w:left w:val="single" w:sz="4" w:space="0" w:color="000000"/>
-              <w:bottom w:val="single" w:sz="4" w:space="0" w:color="000000"/>
-              <w:right w:val="single" w:sz="4" w:space="0" w:color="000000"/>
+              <w:top w:val="single" w:color="000000" w:sz="4" w:space="0"/>
+              <w:left w:val="single" w:color="000000" w:sz="4" w:space="0"/>
+              <w:bottom w:val="single" w:color="000000" w:sz="4" w:space="0"/>
+              <w:right w:val="single" w:color="000000" w:sz="4" w:space="0"/>
             </w:tcBorders>
-            <w:shd w:color="auto" w:fill="DCE6F1" w:val="clear"/>
+            <w:shd w:val="clear" w:color="auto" w:fill="DCE6F1"/>
             <w:vAlign w:val="center"/>
           </w:tcPr>
-          <w:p>
+          <w:p wp14:textId="77777777">
             <w:pPr>
               <w:pStyle w:val="Normal"/>
               <w:jc w:val="center"/>
@@ -898,15 +926,15 @@
           <w:tcPr>
             <w:tcW w:w="1122" w:type="dxa"/>
             <w:tcBorders>
-              <w:top w:val="single" w:sz="4" w:space="0" w:color="000000"/>
-              <w:left w:val="single" w:sz="4" w:space="0" w:color="000000"/>
-              <w:bottom w:val="single" w:sz="4" w:space="0" w:color="000000"/>
-              <w:right w:val="single" w:sz="4" w:space="0" w:color="000000"/>
+              <w:top w:val="single" w:color="000000" w:sz="4" w:space="0"/>
+              <w:left w:val="single" w:color="000000" w:sz="4" w:space="0"/>
+              <w:bottom w:val="single" w:color="000000" w:sz="4" w:space="0"/>
+              <w:right w:val="single" w:color="000000" w:sz="4" w:space="0"/>
             </w:tcBorders>
-            <w:shd w:color="auto" w:fill="DCE6F1" w:val="clear"/>
+            <w:shd w:val="clear" w:color="auto" w:fill="DCE6F1"/>
             <w:vAlign w:val="center"/>
           </w:tcPr>
-          <w:p>
+          <w:p wp14:textId="77777777">
             <w:pPr>
               <w:pStyle w:val="Normal"/>
               <w:jc w:val="center"/>
@@ -919,7 +947,21 @@
                 <w:sz w:val="15"/>
               </w:rPr>
               <w:t>Marks</w:t>
+            </w:r>
+            <w:r>
+              <w:rPr>
+                <w:b/>
+                <w:color w:val="17365D"/>
+                <w:sz w:val="15"/>
+              </w:rPr>
               <w:br/>
+            </w:r>
+            <w:r>
+              <w:rPr>
+                <w:b/>
+                <w:color w:val="17365D"/>
+                <w:sz w:val="15"/>
+              </w:rPr>
               <w:t>(0-3)</w:t>
             </w:r>
           </w:p>
@@ -928,15 +970,15 @@
           <w:tcPr>
             <w:tcW w:w="1125" w:type="dxa"/>
             <w:tcBorders>
-              <w:top w:val="single" w:sz="4" w:space="0" w:color="000000"/>
-              <w:left w:val="single" w:sz="4" w:space="0" w:color="000000"/>
-              <w:bottom w:val="single" w:sz="4" w:space="0" w:color="000000"/>
-              <w:right w:val="single" w:sz="4" w:space="0" w:color="000000"/>
+              <w:top w:val="single" w:color="000000" w:sz="4" w:space="0"/>
+              <w:left w:val="single" w:color="000000" w:sz="4" w:space="0"/>
+              <w:bottom w:val="single" w:color="000000" w:sz="4" w:space="0"/>
+              <w:right w:val="single" w:color="000000" w:sz="4" w:space="0"/>
             </w:tcBorders>
-            <w:shd w:color="auto" w:fill="DCE6F1" w:val="clear"/>
+            <w:shd w:val="clear" w:color="auto" w:fill="DCE6F1"/>
             <w:vAlign w:val="center"/>
           </w:tcPr>
-          <w:p>
+          <w:p wp14:textId="77777777">
             <w:pPr>
               <w:pStyle w:val="Normal"/>
               <w:jc w:val="center"/>
@@ -949,13 +991,27 @@
                 <w:sz w:val="14"/>
               </w:rPr>
               <w:t>Total CO3 marks</w:t>
+            </w:r>
+            <w:r>
+              <w:rPr>
+                <w:b/>
+                <w:color w:val="17365D"/>
+                <w:sz w:val="14"/>
+              </w:rPr>
               <w:br/>
+            </w:r>
+            <w:r>
+              <w:rPr>
+                <w:b/>
+                <w:color w:val="17365D"/>
+                <w:sz w:val="14"/>
+              </w:rPr>
               <w:t>(out of 9)</w:t>
             </w:r>
           </w:p>
         </w:tc>
       </w:tr>
-      <w:tr>
+      <w:tr xmlns:wp14="http://schemas.microsoft.com/office/word/2010/wordml" wp14:textId="77777777">
         <w:trPr>
           <w:trHeight w:val="387" w:hRule="atLeast"/>
         </w:trPr>
@@ -963,14 +1019,14 @@
           <w:tcPr>
             <w:tcW w:w="1123" w:type="dxa"/>
             <w:tcBorders>
-              <w:top w:val="single" w:sz="4" w:space="0" w:color="000000"/>
-              <w:left w:val="single" w:sz="4" w:space="0" w:color="000000"/>
-              <w:bottom w:val="single" w:sz="4" w:space="0" w:color="000000"/>
-              <w:right w:val="single" w:sz="4" w:space="0" w:color="000000"/>
+              <w:top w:val="single" w:color="000000" w:sz="4" w:space="0"/>
+              <w:left w:val="single" w:color="000000" w:sz="4" w:space="0"/>
+              <w:bottom w:val="single" w:color="000000" w:sz="4" w:space="0"/>
+              <w:right w:val="single" w:color="000000" w:sz="4" w:space="0"/>
             </w:tcBorders>
             <w:vAlign w:val="center"/>
           </w:tcPr>
-          <w:p>
+          <w:p wp14:textId="77777777">
             <w:pPr>
               <w:pStyle w:val="Normal"/>
               <w:jc w:val="center"/>
@@ -985,14 +1041,14 @@
           <w:tcPr>
             <w:tcW w:w="1123" w:type="dxa"/>
             <w:tcBorders>
-              <w:top w:val="single" w:sz="4" w:space="0" w:color="000000"/>
-              <w:left w:val="single" w:sz="4" w:space="0" w:color="000000"/>
-              <w:bottom w:val="single" w:sz="4" w:space="0" w:color="000000"/>
-              <w:right w:val="single" w:sz="4" w:space="0" w:color="000000"/>
+              <w:top w:val="single" w:color="000000" w:sz="4" w:space="0"/>
+              <w:left w:val="single" w:color="000000" w:sz="4" w:space="0"/>
+              <w:bottom w:val="single" w:color="000000" w:sz="4" w:space="0"/>
+              <w:right w:val="single" w:color="000000" w:sz="4" w:space="0"/>
             </w:tcBorders>
             <w:vAlign w:val="center"/>
           </w:tcPr>
-          <w:p>
+          <w:p wp14:textId="77777777">
             <w:pPr>
               <w:pStyle w:val="Normal"/>
               <w:jc w:val="center"/>
@@ -1007,14 +1063,14 @@
           <w:tcPr>
             <w:tcW w:w="1123" w:type="dxa"/>
             <w:tcBorders>
-              <w:top w:val="single" w:sz="4" w:space="0" w:color="000000"/>
-              <w:left w:val="single" w:sz="4" w:space="0" w:color="000000"/>
-              <w:bottom w:val="single" w:sz="4" w:space="0" w:color="000000"/>
-              <w:right w:val="single" w:sz="4" w:space="0" w:color="000000"/>
+              <w:top w:val="single" w:color="000000" w:sz="4" w:space="0"/>
+              <w:left w:val="single" w:color="000000" w:sz="4" w:space="0"/>
+              <w:bottom w:val="single" w:color="000000" w:sz="4" w:space="0"/>
+              <w:right w:val="single" w:color="000000" w:sz="4" w:space="0"/>
             </w:tcBorders>
             <w:vAlign w:val="center"/>
           </w:tcPr>
-          <w:p>
+          <w:p wp14:textId="77777777">
             <w:pPr>
               <w:pStyle w:val="Normal"/>
               <w:jc w:val="center"/>
@@ -1030,14 +1086,14 @@
             <w:tcW w:w="1123" w:type="dxa"/>
             <w:gridSpan w:val="2"/>
             <w:tcBorders>
-              <w:top w:val="single" w:sz="4" w:space="0" w:color="000000"/>
-              <w:left w:val="single" w:sz="4" w:space="0" w:color="000000"/>
-              <w:bottom w:val="single" w:sz="4" w:space="0" w:color="000000"/>
-              <w:right w:val="single" w:sz="4" w:space="0" w:color="000000"/>
+              <w:top w:val="single" w:color="000000" w:sz="4" w:space="0"/>
+              <w:left w:val="single" w:color="000000" w:sz="4" w:space="0"/>
+              <w:bottom w:val="single" w:color="000000" w:sz="4" w:space="0"/>
+              <w:right w:val="single" w:color="000000" w:sz="4" w:space="0"/>
             </w:tcBorders>
             <w:vAlign w:val="center"/>
           </w:tcPr>
-          <w:p>
+          <w:p wp14:textId="77777777">
             <w:pPr>
               <w:pStyle w:val="Normal"/>
               <w:jc w:val="center"/>
@@ -1052,14 +1108,14 @@
           <w:tcPr>
             <w:tcW w:w="1124" w:type="dxa"/>
             <w:tcBorders>
-              <w:top w:val="single" w:sz="4" w:space="0" w:color="000000"/>
-              <w:left w:val="single" w:sz="4" w:space="0" w:color="000000"/>
-              <w:bottom w:val="single" w:sz="4" w:space="0" w:color="000000"/>
-              <w:right w:val="single" w:sz="4" w:space="0" w:color="000000"/>
+              <w:top w:val="single" w:color="000000" w:sz="4" w:space="0"/>
+              <w:left w:val="single" w:color="000000" w:sz="4" w:space="0"/>
+              <w:bottom w:val="single" w:color="000000" w:sz="4" w:space="0"/>
+              <w:right w:val="single" w:color="000000" w:sz="4" w:space="0"/>
             </w:tcBorders>
             <w:vAlign w:val="center"/>
           </w:tcPr>
-          <w:p>
+          <w:p wp14:textId="77777777">
             <w:pPr>
               <w:pStyle w:val="Normal"/>
               <w:jc w:val="center"/>
@@ -1074,14 +1130,14 @@
           <w:tcPr>
             <w:tcW w:w="1122" w:type="dxa"/>
             <w:tcBorders>
-              <w:top w:val="single" w:sz="4" w:space="0" w:color="000000"/>
-              <w:left w:val="single" w:sz="4" w:space="0" w:color="000000"/>
-              <w:bottom w:val="single" w:sz="4" w:space="0" w:color="000000"/>
-              <w:right w:val="single" w:sz="4" w:space="0" w:color="000000"/>
+              <w:top w:val="single" w:color="000000" w:sz="4" w:space="0"/>
+              <w:left w:val="single" w:color="000000" w:sz="4" w:space="0"/>
+              <w:bottom w:val="single" w:color="000000" w:sz="4" w:space="0"/>
+              <w:right w:val="single" w:color="000000" w:sz="4" w:space="0"/>
             </w:tcBorders>
             <w:vAlign w:val="center"/>
           </w:tcPr>
-          <w:p>
+          <w:p wp14:textId="77777777">
             <w:pPr>
               <w:pStyle w:val="Normal"/>
               <w:jc w:val="center"/>
@@ -1096,14 +1152,14 @@
           <w:tcPr>
             <w:tcW w:w="1123" w:type="dxa"/>
             <w:tcBorders>
-              <w:top w:val="single" w:sz="4" w:space="0" w:color="000000"/>
-              <w:left w:val="single" w:sz="4" w:space="0" w:color="000000"/>
-              <w:bottom w:val="single" w:sz="4" w:space="0" w:color="000000"/>
-              <w:right w:val="single" w:sz="4" w:space="0" w:color="000000"/>
+              <w:top w:val="single" w:color="000000" w:sz="4" w:space="0"/>
+              <w:left w:val="single" w:color="000000" w:sz="4" w:space="0"/>
+              <w:bottom w:val="single" w:color="000000" w:sz="4" w:space="0"/>
+              <w:right w:val="single" w:color="000000" w:sz="4" w:space="0"/>
             </w:tcBorders>
             <w:vAlign w:val="center"/>
           </w:tcPr>
-          <w:p>
+          <w:p wp14:textId="77777777">
             <w:pPr>
               <w:pStyle w:val="Normal"/>
               <w:jc w:val="center"/>
@@ -1118,14 +1174,14 @@
           <w:tcPr>
             <w:tcW w:w="1123" w:type="dxa"/>
             <w:tcBorders>
-              <w:top w:val="single" w:sz="4" w:space="0" w:color="000000"/>
-              <w:left w:val="single" w:sz="4" w:space="0" w:color="000000"/>
-              <w:bottom w:val="single" w:sz="4" w:space="0" w:color="000000"/>
-              <w:right w:val="single" w:sz="4" w:space="0" w:color="000000"/>
+              <w:top w:val="single" w:color="000000" w:sz="4" w:space="0"/>
+              <w:left w:val="single" w:color="000000" w:sz="4" w:space="0"/>
+              <w:bottom w:val="single" w:color="000000" w:sz="4" w:space="0"/>
+              <w:right w:val="single" w:color="000000" w:sz="4" w:space="0"/>
             </w:tcBorders>
             <w:vAlign w:val="center"/>
           </w:tcPr>
-          <w:p>
+          <w:p wp14:textId="77777777">
             <w:pPr>
               <w:pStyle w:val="Normal"/>
               <w:jc w:val="center"/>
@@ -1140,14 +1196,14 @@
           <w:tcPr>
             <w:tcW w:w="1122" w:type="dxa"/>
             <w:tcBorders>
-              <w:top w:val="single" w:sz="4" w:space="0" w:color="000000"/>
-              <w:left w:val="single" w:sz="4" w:space="0" w:color="000000"/>
-              <w:bottom w:val="single" w:sz="4" w:space="0" w:color="000000"/>
-              <w:right w:val="single" w:sz="4" w:space="0" w:color="000000"/>
+              <w:top w:val="single" w:color="000000" w:sz="4" w:space="0"/>
+              <w:left w:val="single" w:color="000000" w:sz="4" w:space="0"/>
+              <w:bottom w:val="single" w:color="000000" w:sz="4" w:space="0"/>
+              <w:right w:val="single" w:color="000000" w:sz="4" w:space="0"/>
             </w:tcBorders>
             <w:vAlign w:val="center"/>
           </w:tcPr>
-          <w:p>
+          <w:p wp14:textId="77777777">
             <w:pPr>
               <w:pStyle w:val="Normal"/>
               <w:jc w:val="center"/>
@@ -1162,22 +1218,22 @@
           <w:tcPr>
             <w:tcW w:w="1125" w:type="dxa"/>
             <w:tcBorders>
-              <w:top w:val="single" w:sz="4" w:space="0" w:color="000000"/>
-              <w:left w:val="single" w:sz="4" w:space="0" w:color="000000"/>
-              <w:bottom w:val="single" w:sz="4" w:space="0" w:color="000000"/>
-              <w:right w:val="single" w:sz="4" w:space="0" w:color="000000"/>
+              <w:top w:val="single" w:color="000000" w:sz="4" w:space="0"/>
+              <w:left w:val="single" w:color="000000" w:sz="4" w:space="0"/>
+              <w:bottom w:val="single" w:color="000000" w:sz="4" w:space="0"/>
+              <w:right w:val="single" w:color="000000" w:sz="4" w:space="0"/>
             </w:tcBorders>
-            <w:shd w:color="auto" w:fill="0E6B78" w:val="clear"/>
+            <w:shd w:val="clear" w:color="auto" w:fill="0E6B78"/>
             <w:vAlign w:val="center"/>
           </w:tcPr>
-          <w:p>
+          <w:p wp14:textId="77777777">
             <w:pPr>
               <w:pStyle w:val="Normal"/>
               <w:jc w:val="center"/>
               <w:rPr>
                 <w:b/>
                 <w:bCs/>
-                <w:color w:themeColor="background1" w:val="FFFFFF"/>
+                <w:color w:val="FFFFFF" w:themeColor="background1"/>
               </w:rPr>
             </w:pPr>
             <w:r>
@@ -1187,7 +1243,7 @@
         </w:tc>
       </w:tr>
     </w:tbl>
-    <w:p>
+    <w:p xmlns:wp14="http://schemas.microsoft.com/office/word/2010/wordml" wp14:textId="77777777">
       <w:pPr>
         <w:pStyle w:val="Normal"/>
         <w:spacing w:before="320" w:after="320"/>
@@ -1203,49 +1259,43 @@
         <w:t>Repository Evidence</w:t>
       </w:r>
     </w:p>
-    <w:p>
+    <w:p xmlns:wp14="http://schemas.microsoft.com/office/word/2010/wordml" wp14:textId="7BF1C89E">
       <w:pPr>
         <w:pStyle w:val="Normal"/>
         <w:jc w:val="center"/>
-        <w:rPr/>
       </w:pPr>
       <w:r>
-        <w:rPr/>
         <w:drawing>
-          <wp:anchor behindDoc="0" distT="0" distB="0" distL="0" distR="0" simplePos="0" locked="0" layoutInCell="0" allowOverlap="1" relativeHeight="2">
-            <wp:simplePos x="0" y="0"/>
-            <wp:positionH relativeFrom="column">
-              <wp:align>center</wp:align>
-            </wp:positionH>
-            <wp:positionV relativeFrom="paragraph">
-              <wp:posOffset>635</wp:posOffset>
-            </wp:positionV>
-            <wp:extent cx="6002020" cy="2650490"/>
+          <wp:inline xmlns:wp14="http://schemas.microsoft.com/office/word/2010/wordprocessingDrawing" wp14:editId="4FFB13A0" wp14:anchorId="29E5760C">
+            <wp:extent cx="6000750" cy="4208526"/>
             <wp:effectExtent l="0" t="0" r="0" b="0"/>
-            <wp:wrapSquare wrapText="largest"/>
-            <wp:docPr id="1" name="Image1" descr=""/>
+            <wp:docPr id="1238358863" name="drawing"/>
             <wp:cNvGraphicFramePr>
-              <a:graphicFrameLocks xmlns:a="http://schemas.openxmlformats.org/drawingml/2006/main" noChangeAspect="1"/>
+              <a:graphicFrameLocks noChangeAspect="1"/>
             </wp:cNvGraphicFramePr>
-            <a:graphic xmlns:a="http://schemas.openxmlformats.org/drawingml/2006/main">
-              <a:graphicData uri="http://schemas.openxmlformats.org/drawingml/2006/picture">
+            <a:graphic>
+              <a:graphicData xmlns:a="http://schemas.openxmlformats.org/drawingml/2006/main" uri="http://schemas.openxmlformats.org/drawingml/2006/picture">
                 <pic:pic xmlns:pic="http://schemas.openxmlformats.org/drawingml/2006/picture">
                   <pic:nvPicPr>
-                    <pic:cNvPr id="1" name="Image1" descr=""/>
-                    <pic:cNvPicPr>
-                      <a:picLocks noChangeAspect="1" noChangeArrowheads="1"/>
-                    </pic:cNvPicPr>
+                    <pic:cNvPr id="1238358863" name="Picture 1238358863"/>
+                    <pic:cNvPicPr/>
                   </pic:nvPicPr>
                   <pic:blipFill>
-                    <a:blip r:embed="rId2"/>
+                    <a:blip xmlns:r="http://schemas.openxmlformats.org/officeDocument/2006/relationships" r:embed="rId219071418">
+                      <a:extLst>
+                        <a:ext uri="{28A0092B-C50C-407E-A947-70E740481C1C}">
+                          <a14:useLocalDpi xmlns:a14="http://schemas.microsoft.com/office/drawing/2010/main"/>
+                        </a:ext>
+                      </a:extLst>
+                    </a:blip>
                     <a:stretch>
                       <a:fillRect/>
                     </a:stretch>
                   </pic:blipFill>
-                  <pic:spPr bwMode="auto">
-                    <a:xfrm>
+                  <pic:spPr>
+                    <a:xfrm rot="0">
                       <a:off x="0" y="0"/>
-                      <a:ext cx="6002020" cy="2650490"/>
+                      <a:ext cx="6000750" cy="4208526"/>
                     </a:xfrm>
                     <a:prstGeom prst="rect">
                       <a:avLst/>
@@ -1254,11 +1304,11 @@
                 </pic:pic>
               </a:graphicData>
             </a:graphic>
-          </wp:anchor>
+          </wp:inline>
         </w:drawing>
       </w:r>
     </w:p>
-    <w:p>
+    <w:p xmlns:wp14="http://schemas.microsoft.com/office/word/2010/wordml" wp14:textId="77777777">
       <w:pPr>
         <w:pStyle w:val="Normal"/>
         <w:jc w:val="center"/>
@@ -1274,12 +1324,13 @@
     </w:p>
     <w:sectPr>
       <w:type w:val="nextPage"/>
-      <w:pgSz w:w="12240" w:h="15840"/>
-      <w:pgMar w:left="504" w:right="504" w:gutter="0" w:header="0" w:top="504" w:footer="0" w:bottom="576"/>
+      <w:pgSz w:w="12240" w:h="15840" w:orient="portrait"/>
+      <w:pgMar w:top="504" w:right="504" w:bottom="576" w:left="504" w:header="0" w:footer="0" w:gutter="0"/>
       <w:pgNumType w:fmt="decimal"/>
       <w:formProt w:val="false"/>
       <w:textDirection w:val="lrTb"/>
       <w:docGrid w:type="default" w:linePitch="360" w:charSpace="0"/>
+      <w:cols w:num="1"/>
     </w:sectPr>
   </w:body>
 </w:document>
@@ -1300,7 +1351,7 @@
         <w:ind w:left="360" w:hanging="360"/>
       </w:pPr>
       <w:rPr>
-        <w:rFonts w:ascii="Symbol" w:hAnsi="Symbol" w:cs="Symbol" w:hint="default"/>
+        <w:rFonts w:hint="default" w:ascii="Symbol" w:hAnsi="Symbol" w:cs="Symbol"/>
       </w:rPr>
     </w:lvl>
     <w:lvl w:ilvl="1">
@@ -1407,6 +1458,7 @@
       </w:pPr>
       <w:rPr/>
     </w:lvl>
+    <w:nsid w:val="44397eb5"/>
   </w:abstractNum>
   <w:abstractNum w:abstractNumId="2">
     <w:lvl w:ilvl="0">
@@ -1421,7 +1473,7 @@
         <w:ind w:left="720" w:hanging="360"/>
       </w:pPr>
       <w:rPr>
-        <w:rFonts w:ascii="Symbol" w:hAnsi="Symbol" w:cs="Symbol" w:hint="default"/>
+        <w:rFonts w:hint="default" w:ascii="Symbol" w:hAnsi="Symbol" w:cs="Symbol"/>
       </w:rPr>
     </w:lvl>
     <w:lvl w:ilvl="1">
@@ -1528,6 +1580,7 @@
       </w:pPr>
       <w:rPr/>
     </w:lvl>
+    <w:nsid w:val="2e04adbc"/>
   </w:abstractNum>
   <w:abstractNum w:abstractNumId="3">
     <w:lvl w:ilvl="0">
@@ -1542,7 +1595,7 @@
         <w:ind w:left="1080" w:hanging="360"/>
       </w:pPr>
       <w:rPr>
-        <w:rFonts w:ascii="Symbol" w:hAnsi="Symbol" w:cs="Symbol" w:hint="default"/>
+        <w:rFonts w:hint="default" w:ascii="Symbol" w:hAnsi="Symbol" w:cs="Symbol"/>
       </w:rPr>
     </w:lvl>
     <w:lvl w:ilvl="1">
@@ -1649,6 +1702,7 @@
       </w:pPr>
       <w:rPr/>
     </w:lvl>
+    <w:nsid w:val="4944ac0d"/>
   </w:abstractNum>
   <w:abstractNum w:abstractNumId="4">
     <w:lvl w:ilvl="0">
@@ -1768,6 +1822,7 @@
       </w:pPr>
       <w:rPr/>
     </w:lvl>
+    <w:nsid w:val="14b9d899"/>
   </w:abstractNum>
   <w:abstractNum w:abstractNumId="5">
     <w:lvl w:ilvl="0">
@@ -1887,6 +1942,7 @@
       </w:pPr>
       <w:rPr/>
     </w:lvl>
+    <w:nsid w:val="545ea6eb"/>
   </w:abstractNum>
   <w:abstractNum w:abstractNumId="6">
     <w:lvl w:ilvl="0">
@@ -2006,6 +2062,7 @@
       </w:pPr>
       <w:rPr/>
     </w:lvl>
+    <w:nsid w:val="7ea839b6"/>
   </w:abstractNum>
   <w:abstractNum w:abstractNumId="7">
     <w:lvl w:ilvl="0">
@@ -2125,6 +2182,7 @@
         <w:ind w:left="0" w:hanging="0"/>
       </w:pPr>
     </w:lvl>
+    <w:nsid w:val="34f1f8b1"/>
   </w:abstractNum>
   <w:num w:numId="1">
     <w:abstractNumId w:val="1"/>
@@ -2151,11 +2209,11 @@
 </file>
 
 <file path=word/styles.xml><?xml version="1.0" encoding="utf-8"?>
-<w:styles xmlns:w="http://schemas.openxmlformats.org/wordprocessingml/2006/main" xmlns:w14="http://schemas.microsoft.com/office/word/2010/wordml" xmlns:mc="http://schemas.openxmlformats.org/markup-compatibility/2006" mc:Ignorable="w14">
+<w:styles xmlns:wp14="http://schemas.microsoft.com/office/word/2010/wordprocessingDrawing" xmlns:w="http://schemas.openxmlformats.org/wordprocessingml/2006/main" xmlns:w14="http://schemas.microsoft.com/office/word/2010/wordml" xmlns:mc="http://schemas.openxmlformats.org/markup-compatibility/2006" mc:Ignorable="w14 wp14">
   <w:docDefaults>
     <w:rPrDefault>
       <w:rPr>
-        <w:rFonts w:ascii="Cambria" w:hAnsi="Cambria" w:eastAsia="" w:cs="" w:asciiTheme="minorHAnsi" w:cstheme="minorBidi" w:eastAsiaTheme="minorEastAsia" w:hAnsiTheme="minorHAnsi"/>
+        <w:rFonts w:ascii="Cambria" w:hAnsi="Cambria" w:eastAsia="" w:cs="" w:asciiTheme="minorHAnsi" w:hAnsiTheme="minorHAnsi" w:eastAsiaTheme="minorEastAsia" w:cstheme="minorBidi"/>
         <w:sz w:val="22"/>
         <w:szCs w:val="22"/>
         <w:lang w:val="en-US" w:eastAsia="en-US" w:bidi="ar-SA"/>
@@ -2544,11 +2602,11 @@
       <w:widowControl/>
       <w:suppressAutoHyphens w:val="true"/>
       <w:bidi w:val="0"/>
-      <w:spacing w:lineRule="auto" w:line="240" w:before="0" w:after="0"/>
+      <w:spacing w:before="0" w:after="0" w:line="240" w:lineRule="auto"/>
       <w:jc w:val="left"/>
     </w:pPr>
     <w:rPr>
-      <w:rFonts w:ascii="Arial" w:hAnsi="Arial" w:eastAsia="" w:cs="" w:cstheme="minorBidi" w:eastAsiaTheme="minorEastAsia"/>
+      <w:rFonts w:ascii="Arial" w:hAnsi="Arial" w:eastAsia="" w:cs="" w:eastAsiaTheme="minorEastAsia" w:cstheme="minorBidi"/>
       <w:color w:val="auto"/>
       <w:kern w:val="0"/>
       <w:sz w:val="16"/>
@@ -2557,7 +2615,7 @@
     </w:rPr>
   </w:style>
   <w:style w:type="paragraph" w:styleId="Heading1">
-    <w:name w:val="Heading 1"/>
+    <w:name w:val="heading 1"/>
     <w:basedOn w:val="Normal"/>
     <w:next w:val="Normal"/>
     <w:link w:val="Heading1Char"/>
@@ -2571,16 +2629,16 @@
       <w:outlineLvl w:val="0"/>
     </w:pPr>
     <w:rPr>
-      <w:rFonts w:ascii="Calibri" w:hAnsi="Calibri" w:eastAsia="" w:cs="" w:asciiTheme="majorHAnsi" w:cstheme="majorBidi" w:eastAsiaTheme="majorEastAsia" w:hAnsiTheme="majorHAnsi"/>
+      <w:rFonts w:ascii="Calibri" w:hAnsi="Calibri" w:eastAsia="" w:cs="" w:asciiTheme="majorHAnsi" w:hAnsiTheme="majorHAnsi" w:eastAsiaTheme="majorEastAsia" w:cstheme="majorBidi"/>
       <w:b/>
       <w:bCs/>
-      <w:color w:themeColor="accent1" w:themeShade="bf" w:val="365F91"/>
+      <w:color w:val="365F91" w:themeColor="accent1" w:themeShade="bf"/>
       <w:sz w:val="28"/>
       <w:szCs w:val="28"/>
     </w:rPr>
   </w:style>
   <w:style w:type="paragraph" w:styleId="Heading2">
-    <w:name w:val="Heading 2"/>
+    <w:name w:val="heading 2"/>
     <w:basedOn w:val="Normal"/>
     <w:next w:val="Normal"/>
     <w:link w:val="Heading2Char"/>
@@ -2595,16 +2653,16 @@
       <w:outlineLvl w:val="1"/>
     </w:pPr>
     <w:rPr>
-      <w:rFonts w:ascii="Calibri" w:hAnsi="Calibri" w:eastAsia="" w:cs="" w:asciiTheme="majorHAnsi" w:cstheme="majorBidi" w:eastAsiaTheme="majorEastAsia" w:hAnsiTheme="majorHAnsi"/>
+      <w:rFonts w:ascii="Calibri" w:hAnsi="Calibri" w:eastAsia="" w:cs="" w:asciiTheme="majorHAnsi" w:hAnsiTheme="majorHAnsi" w:eastAsiaTheme="majorEastAsia" w:cstheme="majorBidi"/>
       <w:b/>
       <w:bCs/>
-      <w:color w:themeColor="accent1" w:val="4F81BD"/>
+      <w:color w:val="4F81BD" w:themeColor="accent1"/>
       <w:sz w:val="26"/>
       <w:szCs w:val="26"/>
     </w:rPr>
   </w:style>
   <w:style w:type="paragraph" w:styleId="Heading3">
-    <w:name w:val="Heading 3"/>
+    <w:name w:val="heading 3"/>
     <w:basedOn w:val="Normal"/>
     <w:next w:val="Normal"/>
     <w:link w:val="Heading3Char"/>
@@ -2619,14 +2677,14 @@
       <w:outlineLvl w:val="2"/>
     </w:pPr>
     <w:rPr>
-      <w:rFonts w:ascii="Calibri" w:hAnsi="Calibri" w:eastAsia="" w:cs="" w:asciiTheme="majorHAnsi" w:cstheme="majorBidi" w:eastAsiaTheme="majorEastAsia" w:hAnsiTheme="majorHAnsi"/>
+      <w:rFonts w:ascii="Calibri" w:hAnsi="Calibri" w:eastAsia="" w:cs="" w:asciiTheme="majorHAnsi" w:hAnsiTheme="majorHAnsi" w:eastAsiaTheme="majorEastAsia" w:cstheme="majorBidi"/>
       <w:b/>
       <w:bCs/>
-      <w:color w:themeColor="accent1" w:val="4F81BD"/>
+      <w:color w:val="4F81BD" w:themeColor="accent1"/>
     </w:rPr>
   </w:style>
   <w:style w:type="paragraph" w:styleId="Heading4">
-    <w:name w:val="Heading 4"/>
+    <w:name w:val="heading 4"/>
     <w:basedOn w:val="Normal"/>
     <w:next w:val="Normal"/>
     <w:link w:val="Heading4Char"/>
@@ -2642,16 +2700,16 @@
       <w:outlineLvl w:val="3"/>
     </w:pPr>
     <w:rPr>
-      <w:rFonts w:ascii="Calibri" w:hAnsi="Calibri" w:eastAsia="" w:cs="" w:asciiTheme="majorHAnsi" w:cstheme="majorBidi" w:eastAsiaTheme="majorEastAsia" w:hAnsiTheme="majorHAnsi"/>
+      <w:rFonts w:ascii="Calibri" w:hAnsi="Calibri" w:eastAsia="" w:cs="" w:asciiTheme="majorHAnsi" w:hAnsiTheme="majorHAnsi" w:eastAsiaTheme="majorEastAsia" w:cstheme="majorBidi"/>
       <w:b/>
       <w:bCs/>
       <w:i/>
       <w:iCs/>
-      <w:color w:themeColor="accent1" w:val="4F81BD"/>
+      <w:color w:val="4F81BD" w:themeColor="accent1"/>
     </w:rPr>
   </w:style>
   <w:style w:type="paragraph" w:styleId="Heading5">
-    <w:name w:val="Heading 5"/>
+    <w:name w:val="heading 5"/>
     <w:basedOn w:val="Normal"/>
     <w:next w:val="Normal"/>
     <w:link w:val="Heading5Char"/>
@@ -2667,12 +2725,12 @@
       <w:outlineLvl w:val="4"/>
     </w:pPr>
     <w:rPr>
-      <w:rFonts w:ascii="Calibri" w:hAnsi="Calibri" w:eastAsia="" w:cs="" w:asciiTheme="majorHAnsi" w:cstheme="majorBidi" w:eastAsiaTheme="majorEastAsia" w:hAnsiTheme="majorHAnsi"/>
-      <w:color w:themeColor="accent1" w:themeShade="7f" w:val="243F60"/>
+      <w:rFonts w:ascii="Calibri" w:hAnsi="Calibri" w:eastAsia="" w:cs="" w:asciiTheme="majorHAnsi" w:hAnsiTheme="majorHAnsi" w:eastAsiaTheme="majorEastAsia" w:cstheme="majorBidi"/>
+      <w:color w:val="243F60" w:themeColor="accent1" w:themeShade="7f"/>
     </w:rPr>
   </w:style>
   <w:style w:type="paragraph" w:styleId="Heading6">
-    <w:name w:val="Heading 6"/>
+    <w:name w:val="heading 6"/>
     <w:basedOn w:val="Normal"/>
     <w:next w:val="Normal"/>
     <w:link w:val="Heading6Char"/>
@@ -2688,14 +2746,14 @@
       <w:outlineLvl w:val="5"/>
     </w:pPr>
     <w:rPr>
-      <w:rFonts w:ascii="Calibri" w:hAnsi="Calibri" w:eastAsia="" w:cs="" w:asciiTheme="majorHAnsi" w:cstheme="majorBidi" w:eastAsiaTheme="majorEastAsia" w:hAnsiTheme="majorHAnsi"/>
+      <w:rFonts w:ascii="Calibri" w:hAnsi="Calibri" w:eastAsia="" w:cs="" w:asciiTheme="majorHAnsi" w:hAnsiTheme="majorHAnsi" w:eastAsiaTheme="majorEastAsia" w:cstheme="majorBidi"/>
       <w:i/>
       <w:iCs/>
-      <w:color w:themeColor="accent1" w:themeShade="7f" w:val="243F60"/>
+      <w:color w:val="243F60" w:themeColor="accent1" w:themeShade="7f"/>
     </w:rPr>
   </w:style>
   <w:style w:type="paragraph" w:styleId="Heading7">
-    <w:name w:val="Heading 7"/>
+    <w:name w:val="heading 7"/>
     <w:basedOn w:val="Normal"/>
     <w:next w:val="Normal"/>
     <w:link w:val="Heading7Char"/>
@@ -2711,14 +2769,14 @@
       <w:outlineLvl w:val="6"/>
     </w:pPr>
     <w:rPr>
-      <w:rFonts w:ascii="Calibri" w:hAnsi="Calibri" w:eastAsia="" w:cs="" w:asciiTheme="majorHAnsi" w:cstheme="majorBidi" w:eastAsiaTheme="majorEastAsia" w:hAnsiTheme="majorHAnsi"/>
+      <w:rFonts w:ascii="Calibri" w:hAnsi="Calibri" w:eastAsia="" w:cs="" w:asciiTheme="majorHAnsi" w:hAnsiTheme="majorHAnsi" w:eastAsiaTheme="majorEastAsia" w:cstheme="majorBidi"/>
       <w:i/>
       <w:iCs/>
-      <w:color w:themeColor="text1" w:themeTint="bf" w:val="404040"/>
+      <w:color w:val="404040" w:themeColor="text1" w:themeTint="bf"/>
     </w:rPr>
   </w:style>
   <w:style w:type="paragraph" w:styleId="Heading8">
-    <w:name w:val="Heading 8"/>
+    <w:name w:val="heading 8"/>
     <w:basedOn w:val="Normal"/>
     <w:next w:val="Normal"/>
     <w:link w:val="Heading8Char"/>
@@ -2734,14 +2792,14 @@
       <w:outlineLvl w:val="7"/>
     </w:pPr>
     <w:rPr>
-      <w:rFonts w:ascii="Calibri" w:hAnsi="Calibri" w:eastAsia="" w:cs="" w:asciiTheme="majorHAnsi" w:cstheme="majorBidi" w:eastAsiaTheme="majorEastAsia" w:hAnsiTheme="majorHAnsi"/>
-      <w:color w:themeColor="accent1" w:val="4F81BD"/>
+      <w:rFonts w:ascii="Calibri" w:hAnsi="Calibri" w:eastAsia="" w:cs="" w:asciiTheme="majorHAnsi" w:hAnsiTheme="majorHAnsi" w:eastAsiaTheme="majorEastAsia" w:cstheme="majorBidi"/>
+      <w:color w:val="4F81BD" w:themeColor="accent1"/>
       <w:sz w:val="20"/>
       <w:szCs w:val="20"/>
     </w:rPr>
   </w:style>
   <w:style w:type="paragraph" w:styleId="Heading9">
-    <w:name w:val="Heading 9"/>
+    <w:name w:val="heading 9"/>
     <w:basedOn w:val="Normal"/>
     <w:next w:val="Normal"/>
     <w:link w:val="Heading9Char"/>
@@ -2757,10 +2815,10 @@
       <w:outlineLvl w:val="8"/>
     </w:pPr>
     <w:rPr>
-      <w:rFonts w:ascii="Calibri" w:hAnsi="Calibri" w:eastAsia="" w:cs="" w:asciiTheme="majorHAnsi" w:cstheme="majorBidi" w:eastAsiaTheme="majorEastAsia" w:hAnsiTheme="majorHAnsi"/>
+      <w:rFonts w:ascii="Calibri" w:hAnsi="Calibri" w:eastAsia="" w:cs="" w:asciiTheme="majorHAnsi" w:hAnsiTheme="majorHAnsi" w:eastAsiaTheme="majorEastAsia" w:cstheme="majorBidi"/>
       <w:i/>
       <w:iCs/>
-      <w:color w:themeColor="text1" w:themeTint="bf" w:val="404040"/>
+      <w:color w:val="404040" w:themeColor="text1" w:themeTint="bf"/>
       <w:sz w:val="20"/>
       <w:szCs w:val="20"/>
     </w:rPr>
@@ -2798,10 +2856,10 @@
     <w:qFormat/>
     <w:rsid w:val="00fc693f"/>
     <w:rPr>
-      <w:rFonts w:ascii="Calibri" w:hAnsi="Calibri" w:eastAsia="" w:cs="" w:asciiTheme="majorHAnsi" w:cstheme="majorBidi" w:eastAsiaTheme="majorEastAsia" w:hAnsiTheme="majorHAnsi"/>
+      <w:rFonts w:ascii="Calibri" w:hAnsi="Calibri" w:eastAsia="" w:cs="" w:asciiTheme="majorHAnsi" w:hAnsiTheme="majorHAnsi" w:eastAsiaTheme="majorEastAsia" w:cstheme="majorBidi"/>
       <w:b/>
       <w:bCs/>
-      <w:color w:themeColor="accent1" w:themeShade="bf" w:val="365F91"/>
+      <w:color w:val="365F91" w:themeColor="accent1" w:themeShade="bf"/>
       <w:sz w:val="28"/>
       <w:szCs w:val="28"/>
     </w:rPr>
@@ -2814,10 +2872,10 @@
     <w:qFormat/>
     <w:rsid w:val="00fc693f"/>
     <w:rPr>
-      <w:rFonts w:ascii="Calibri" w:hAnsi="Calibri" w:eastAsia="" w:cs="" w:asciiTheme="majorHAnsi" w:cstheme="majorBidi" w:eastAsiaTheme="majorEastAsia" w:hAnsiTheme="majorHAnsi"/>
+      <w:rFonts w:ascii="Calibri" w:hAnsi="Calibri" w:eastAsia="" w:cs="" w:asciiTheme="majorHAnsi" w:hAnsiTheme="majorHAnsi" w:eastAsiaTheme="majorEastAsia" w:cstheme="majorBidi"/>
       <w:b/>
       <w:bCs/>
-      <w:color w:themeColor="accent1" w:val="4F81BD"/>
+      <w:color w:val="4F81BD" w:themeColor="accent1"/>
       <w:sz w:val="26"/>
       <w:szCs w:val="26"/>
     </w:rPr>
@@ -2830,10 +2888,10 @@
     <w:qFormat/>
     <w:rsid w:val="00fc693f"/>
     <w:rPr>
-      <w:rFonts w:ascii="Calibri" w:hAnsi="Calibri" w:eastAsia="" w:cs="" w:asciiTheme="majorHAnsi" w:cstheme="majorBidi" w:eastAsiaTheme="majorEastAsia" w:hAnsiTheme="majorHAnsi"/>
+      <w:rFonts w:ascii="Calibri" w:hAnsi="Calibri" w:eastAsia="" w:cs="" w:asciiTheme="majorHAnsi" w:hAnsiTheme="majorHAnsi" w:eastAsiaTheme="majorEastAsia" w:cstheme="majorBidi"/>
       <w:b/>
       <w:bCs/>
-      <w:color w:themeColor="accent1" w:val="4F81BD"/>
+      <w:color w:val="4F81BD" w:themeColor="accent1"/>
     </w:rPr>
   </w:style>
   <w:style w:type="character" w:styleId="TitleChar" w:customStyle="1">
@@ -2844,8 +2902,8 @@
     <w:qFormat/>
     <w:rsid w:val="00fc693f"/>
     <w:rPr>
-      <w:rFonts w:ascii="Calibri" w:hAnsi="Calibri" w:eastAsia="" w:cs="" w:asciiTheme="majorHAnsi" w:cstheme="majorBidi" w:eastAsiaTheme="majorEastAsia" w:hAnsiTheme="majorHAnsi"/>
-      <w:color w:themeColor="text2" w:themeShade="bf" w:val="17365D"/>
+      <w:rFonts w:ascii="Calibri" w:hAnsi="Calibri" w:eastAsia="" w:cs="" w:asciiTheme="majorHAnsi" w:hAnsiTheme="majorHAnsi" w:eastAsiaTheme="majorEastAsia" w:cstheme="majorBidi"/>
+      <w:color w:val="17365D" w:themeColor="text2" w:themeShade="bf"/>
       <w:spacing w:val="5"/>
       <w:kern w:val="2"/>
       <w:sz w:val="52"/>
@@ -2860,10 +2918,10 @@
     <w:qFormat/>
     <w:rsid w:val="00fc693f"/>
     <w:rPr>
-      <w:rFonts w:ascii="Calibri" w:hAnsi="Calibri" w:eastAsia="" w:cs="" w:asciiTheme="majorHAnsi" w:cstheme="majorBidi" w:eastAsiaTheme="majorEastAsia" w:hAnsiTheme="majorHAnsi"/>
+      <w:rFonts w:ascii="Calibri" w:hAnsi="Calibri" w:eastAsia="" w:cs="" w:asciiTheme="majorHAnsi" w:hAnsiTheme="majorHAnsi" w:eastAsiaTheme="majorEastAsia" w:cstheme="majorBidi"/>
       <w:i/>
       <w:iCs/>
-      <w:color w:themeColor="accent1" w:val="4F81BD"/>
+      <w:color w:val="4F81BD" w:themeColor="accent1"/>
       <w:spacing w:val="15"/>
       <w:sz w:val="24"/>
       <w:szCs w:val="24"/>
@@ -2921,7 +2979,7 @@
     <w:rPr>
       <w:i/>
       <w:iCs/>
-      <w:color w:themeColor="text1" w:val="000000"/>
+      <w:color w:val="000000" w:themeColor="text1"/>
     </w:rPr>
   </w:style>
   <w:style w:type="character" w:styleId="Heading4Char" w:customStyle="1">
@@ -2933,12 +2991,12 @@
     <w:qFormat/>
     <w:rsid w:val="00fc693f"/>
     <w:rPr>
-      <w:rFonts w:ascii="Calibri" w:hAnsi="Calibri" w:eastAsia="" w:cs="" w:asciiTheme="majorHAnsi" w:cstheme="majorBidi" w:eastAsiaTheme="majorEastAsia" w:hAnsiTheme="majorHAnsi"/>
+      <w:rFonts w:ascii="Calibri" w:hAnsi="Calibri" w:eastAsia="" w:cs="" w:asciiTheme="majorHAnsi" w:hAnsiTheme="majorHAnsi" w:eastAsiaTheme="majorEastAsia" w:cstheme="majorBidi"/>
       <w:b/>
       <w:bCs/>
       <w:i/>
       <w:iCs/>
-      <w:color w:themeColor="accent1" w:val="4F81BD"/>
+      <w:color w:val="4F81BD" w:themeColor="accent1"/>
     </w:rPr>
   </w:style>
   <w:style w:type="character" w:styleId="Heading5Char" w:customStyle="1">
@@ -2950,8 +3008,8 @@
     <w:qFormat/>
     <w:rsid w:val="00fc693f"/>
     <w:rPr>
-      <w:rFonts w:ascii="Calibri" w:hAnsi="Calibri" w:eastAsia="" w:cs="" w:asciiTheme="majorHAnsi" w:cstheme="majorBidi" w:eastAsiaTheme="majorEastAsia" w:hAnsiTheme="majorHAnsi"/>
-      <w:color w:themeColor="accent1" w:themeShade="7f" w:val="243F60"/>
+      <w:rFonts w:ascii="Calibri" w:hAnsi="Calibri" w:eastAsia="" w:cs="" w:asciiTheme="majorHAnsi" w:hAnsiTheme="majorHAnsi" w:eastAsiaTheme="majorEastAsia" w:cstheme="majorBidi"/>
+      <w:color w:val="243F60" w:themeColor="accent1" w:themeShade="7f"/>
     </w:rPr>
   </w:style>
   <w:style w:type="character" w:styleId="Heading6Char" w:customStyle="1">
@@ -2963,10 +3021,10 @@
     <w:qFormat/>
     <w:rsid w:val="00fc693f"/>
     <w:rPr>
-      <w:rFonts w:ascii="Calibri" w:hAnsi="Calibri" w:eastAsia="" w:cs="" w:asciiTheme="majorHAnsi" w:cstheme="majorBidi" w:eastAsiaTheme="majorEastAsia" w:hAnsiTheme="majorHAnsi"/>
+      <w:rFonts w:ascii="Calibri" w:hAnsi="Calibri" w:eastAsia="" w:cs="" w:asciiTheme="majorHAnsi" w:hAnsiTheme="majorHAnsi" w:eastAsiaTheme="majorEastAsia" w:cstheme="majorBidi"/>
       <w:i/>
       <w:iCs/>
-      <w:color w:themeColor="accent1" w:themeShade="7f" w:val="243F60"/>
+      <w:color w:val="243F60" w:themeColor="accent1" w:themeShade="7f"/>
     </w:rPr>
   </w:style>
   <w:style w:type="character" w:styleId="Heading7Char" w:customStyle="1">
@@ -2978,10 +3036,10 @@
     <w:qFormat/>
     <w:rsid w:val="00fc693f"/>
     <w:rPr>
-      <w:rFonts w:ascii="Calibri" w:hAnsi="Calibri" w:eastAsia="" w:cs="" w:asciiTheme="majorHAnsi" w:cstheme="majorBidi" w:eastAsiaTheme="majorEastAsia" w:hAnsiTheme="majorHAnsi"/>
+      <w:rFonts w:ascii="Calibri" w:hAnsi="Calibri" w:eastAsia="" w:cs="" w:asciiTheme="majorHAnsi" w:hAnsiTheme="majorHAnsi" w:eastAsiaTheme="majorEastAsia" w:cstheme="majorBidi"/>
       <w:i/>
       <w:iCs/>
-      <w:color w:themeColor="text1" w:themeTint="bf" w:val="404040"/>
+      <w:color w:val="404040" w:themeColor="text1" w:themeTint="bf"/>
     </w:rPr>
   </w:style>
   <w:style w:type="character" w:styleId="Heading8Char" w:customStyle="1">
@@ -2993,8 +3051,8 @@
     <w:qFormat/>
     <w:rsid w:val="00fc693f"/>
     <w:rPr>
-      <w:rFonts w:ascii="Calibri" w:hAnsi="Calibri" w:eastAsia="" w:cs="" w:asciiTheme="majorHAnsi" w:cstheme="majorBidi" w:eastAsiaTheme="majorEastAsia" w:hAnsiTheme="majorHAnsi"/>
-      <w:color w:themeColor="accent1" w:val="4F81BD"/>
+      <w:rFonts w:ascii="Calibri" w:hAnsi="Calibri" w:eastAsia="" w:cs="" w:asciiTheme="majorHAnsi" w:hAnsiTheme="majorHAnsi" w:eastAsiaTheme="majorEastAsia" w:cstheme="majorBidi"/>
+      <w:color w:val="4F81BD" w:themeColor="accent1"/>
       <w:sz w:val="20"/>
       <w:szCs w:val="20"/>
     </w:rPr>
@@ -3008,10 +3066,10 @@
     <w:qFormat/>
     <w:rsid w:val="00fc693f"/>
     <w:rPr>
-      <w:rFonts w:ascii="Calibri" w:hAnsi="Calibri" w:eastAsia="" w:cs="" w:asciiTheme="majorHAnsi" w:cstheme="majorBidi" w:eastAsiaTheme="majorEastAsia" w:hAnsiTheme="majorHAnsi"/>
+      <w:rFonts w:ascii="Calibri" w:hAnsi="Calibri" w:eastAsia="" w:cs="" w:asciiTheme="majorHAnsi" w:hAnsiTheme="majorHAnsi" w:eastAsiaTheme="majorEastAsia" w:cstheme="majorBidi"/>
       <w:i/>
       <w:iCs/>
-      <w:color w:themeColor="text1" w:themeTint="bf" w:val="404040"/>
+      <w:color w:val="404040" w:themeColor="text1" w:themeTint="bf"/>
       <w:sz w:val="20"/>
       <w:szCs w:val="20"/>
     </w:rPr>
@@ -3050,7 +3108,7 @@
       <w:bCs/>
       <w:i/>
       <w:iCs/>
-      <w:color w:themeColor="accent1" w:val="4F81BD"/>
+      <w:color w:val="4F81BD" w:themeColor="accent1"/>
     </w:rPr>
   </w:style>
   <w:style w:type="character" w:styleId="SubtleEmphasis">
@@ -3062,7 +3120,7 @@
     <w:rPr>
       <w:i/>
       <w:iCs/>
-      <w:color w:themeColor="text1" w:themeTint="7f" w:val="808080"/>
+      <w:color w:val="808080" w:themeColor="text1" w:themeTint="7f"/>
     </w:rPr>
   </w:style>
   <w:style w:type="character" w:styleId="IntenseEmphasis">
@@ -3076,7 +3134,7 @@
       <w:bCs/>
       <w:i/>
       <w:iCs/>
-      <w:color w:themeColor="accent1" w:val="4F81BD"/>
+      <w:color w:val="4F81BD" w:themeColor="accent1"/>
     </w:rPr>
   </w:style>
   <w:style w:type="character" w:styleId="SubtleReference">
@@ -3087,7 +3145,7 @@
     <w:rsid w:val="00fc693f"/>
     <w:rPr>
       <w:smallCaps/>
-      <w:color w:themeColor="accent2" w:val="C0504D"/>
+      <w:color w:val="C0504D" w:themeColor="accent2"/>
       <w:u w:val="single"/>
     </w:rPr>
   </w:style>
@@ -3101,7 +3159,7 @@
       <w:b/>
       <w:bCs/>
       <w:smallCaps/>
-      <w:color w:themeColor="accent2" w:val="C0504D"/>
+      <w:color w:val="C0504D" w:themeColor="accent2"/>
       <w:spacing w:val="5"/>
       <w:u w:val="single"/>
     </w:rPr>
@@ -3154,7 +3212,7 @@
     <w:rsid w:val="00aa1d8d"/>
     <w:pPr>
       <w:spacing w:before="0" w:after="0"/>
-      <w:ind w:hanging="360" w:left="360"/>
+      <w:ind w:left="360" w:hanging="360"/>
       <w:contextualSpacing/>
     </w:pPr>
     <w:rPr/>
@@ -3172,7 +3230,7 @@
     <w:rPr>
       <w:b/>
       <w:bCs/>
-      <w:color w:themeColor="accent1" w:val="4F81BD"/>
+      <w:color w:val="4F81BD" w:themeColor="accent1"/>
       <w:sz w:val="18"/>
       <w:szCs w:val="18"/>
     </w:rPr>
@@ -3196,7 +3254,7 @@
     <w:rPr/>
   </w:style>
   <w:style w:type="paragraph" w:styleId="Header">
-    <w:name w:val="Header"/>
+    <w:name w:val="header"/>
     <w:basedOn w:val="Normal"/>
     <w:link w:val="HeaderChar"/>
     <w:uiPriority w:val="99"/>
@@ -3205,14 +3263,14 @@
     <w:pPr>
       <w:tabs>
         <w:tab w:val="clear" w:pos="720"/>
-        <w:tab w:val="center" w:pos="4680" w:leader="none"/>
-        <w:tab w:val="right" w:pos="9360" w:leader="none"/>
+        <w:tab w:val="center" w:leader="none" w:pos="4680"/>
+        <w:tab w:val="right" w:leader="none" w:pos="9360"/>
       </w:tabs>
     </w:pPr>
     <w:rPr/>
   </w:style>
   <w:style w:type="paragraph" w:styleId="Footer">
-    <w:name w:val="Footer"/>
+    <w:name w:val="footer"/>
     <w:basedOn w:val="Normal"/>
     <w:link w:val="FooterChar"/>
     <w:uiPriority w:val="99"/>
@@ -3221,8 +3279,8 @@
     <w:pPr>
       <w:tabs>
         <w:tab w:val="clear" w:pos="720"/>
-        <w:tab w:val="center" w:pos="4680" w:leader="none"/>
-        <w:tab w:val="right" w:pos="9360" w:leader="none"/>
+        <w:tab w:val="center" w:leader="none" w:pos="4680"/>
+        <w:tab w:val="right" w:leader="none" w:pos="9360"/>
       </w:tabs>
     </w:pPr>
     <w:rPr/>
@@ -3236,11 +3294,11 @@
       <w:widowControl/>
       <w:suppressAutoHyphens w:val="true"/>
       <w:bidi w:val="0"/>
-      <w:spacing w:lineRule="auto" w:line="240" w:before="0" w:after="0"/>
+      <w:spacing w:before="0" w:after="0" w:line="240" w:lineRule="auto"/>
       <w:jc w:val="left"/>
     </w:pPr>
     <w:rPr>
-      <w:rFonts w:ascii="Cambria" w:hAnsi="Cambria" w:eastAsia="" w:cs="" w:asciiTheme="minorHAnsi" w:cstheme="minorBidi" w:eastAsiaTheme="minorEastAsia" w:hAnsiTheme="minorHAnsi"/>
+      <w:rFonts w:ascii="Cambria" w:hAnsi="Cambria" w:eastAsia="" w:cs="" w:asciiTheme="minorHAnsi" w:hAnsiTheme="minorHAnsi" w:eastAsiaTheme="minorEastAsia" w:cstheme="minorBidi"/>
       <w:color w:val="auto"/>
       <w:kern w:val="0"/>
       <w:sz w:val="22"/>
@@ -3258,14 +3316,14 @@
     <w:rsid w:val="00fc693f"/>
     <w:pPr>
       <w:pBdr>
-        <w:bottom w:val="single" w:sz="8" w:space="4" w:color="4F81BD" w:themeColor="accent1"/>
+        <w:bottom w:val="single" w:color="4F81BD" w:themeColor="accent1" w:sz="8" w:space="4"/>
       </w:pBdr>
       <w:spacing w:before="0" w:after="300"/>
       <w:contextualSpacing/>
     </w:pPr>
     <w:rPr>
-      <w:rFonts w:ascii="Calibri" w:hAnsi="Calibri" w:eastAsia="" w:cs="" w:asciiTheme="majorHAnsi" w:cstheme="majorBidi" w:eastAsiaTheme="majorEastAsia" w:hAnsiTheme="majorHAnsi"/>
-      <w:color w:themeColor="text2" w:themeShade="bf" w:val="17365D"/>
+      <w:rFonts w:ascii="Calibri" w:hAnsi="Calibri" w:eastAsia="" w:cs="" w:asciiTheme="majorHAnsi" w:hAnsiTheme="majorHAnsi" w:eastAsiaTheme="majorEastAsia" w:cstheme="majorBidi"/>
+      <w:color w:val="17365D" w:themeColor="text2" w:themeShade="bf"/>
       <w:spacing w:val="5"/>
       <w:kern w:val="2"/>
       <w:sz w:val="52"/>
@@ -3282,10 +3340,10 @@
     <w:rsid w:val="00fc693f"/>
     <w:pPr/>
     <w:rPr>
-      <w:rFonts w:ascii="Calibri" w:hAnsi="Calibri" w:eastAsia="" w:cs="" w:asciiTheme="majorHAnsi" w:cstheme="majorBidi" w:eastAsiaTheme="majorEastAsia" w:hAnsiTheme="majorHAnsi"/>
+      <w:rFonts w:ascii="Calibri" w:hAnsi="Calibri" w:eastAsia="" w:cs="" w:asciiTheme="majorHAnsi" w:hAnsiTheme="majorHAnsi" w:eastAsiaTheme="majorEastAsia" w:cstheme="majorBidi"/>
       <w:i/>
       <w:iCs/>
-      <w:color w:themeColor="accent1" w:val="4F81BD"/>
+      <w:color w:val="4F81BD" w:themeColor="accent1"/>
       <w:spacing w:val="15"/>
       <w:sz w:val="24"/>
       <w:szCs w:val="24"/>
@@ -3313,7 +3371,7 @@
     <w:qFormat/>
     <w:rsid w:val="00aa1d8d"/>
     <w:pPr>
-      <w:spacing w:lineRule="auto" w:line="480" w:before="0" w:after="120"/>
+      <w:spacing w:before="0" w:after="120" w:line="480" w:lineRule="auto"/>
     </w:pPr>
     <w:rPr/>
   </w:style>
@@ -3341,7 +3399,7 @@
     <w:rsid w:val="00326f90"/>
     <w:pPr>
       <w:spacing w:before="0" w:after="0"/>
-      <w:ind w:hanging="360" w:left="720"/>
+      <w:ind w:left="720" w:hanging="360"/>
       <w:contextualSpacing/>
     </w:pPr>
     <w:rPr/>
@@ -3355,7 +3413,7 @@
     <w:rsid w:val="00326f90"/>
     <w:pPr>
       <w:spacing w:before="0" w:after="0"/>
-      <w:ind w:hanging="360" w:left="1080"/>
+      <w:ind w:left="1080" w:hanging="360"/>
       <w:contextualSpacing/>
     </w:pPr>
     <w:rPr/>
@@ -3506,21 +3564,21 @@
       <w:widowControl/>
       <w:tabs>
         <w:tab w:val="clear" w:pos="720"/>
-        <w:tab w:val="left" w:pos="576" w:leader="none"/>
-        <w:tab w:val="left" w:pos="1152" w:leader="none"/>
-        <w:tab w:val="left" w:pos="1728" w:leader="none"/>
-        <w:tab w:val="left" w:pos="2304" w:leader="none"/>
-        <w:tab w:val="left" w:pos="2880" w:leader="none"/>
-        <w:tab w:val="left" w:pos="3456" w:leader="none"/>
-        <w:tab w:val="left" w:pos="4032" w:leader="none"/>
+        <w:tab w:val="left" w:leader="none" w:pos="576"/>
+        <w:tab w:val="left" w:leader="none" w:pos="1152"/>
+        <w:tab w:val="left" w:leader="none" w:pos="1728"/>
+        <w:tab w:val="left" w:leader="none" w:pos="2304"/>
+        <w:tab w:val="left" w:leader="none" w:pos="2880"/>
+        <w:tab w:val="left" w:leader="none" w:pos="3456"/>
+        <w:tab w:val="left" w:leader="none" w:pos="4032"/>
       </w:tabs>
       <w:suppressAutoHyphens w:val="true"/>
       <w:bidi w:val="0"/>
-      <w:spacing w:lineRule="auto" w:line="276" w:before="0" w:after="200"/>
+      <w:spacing w:before="0" w:after="200" w:line="276" w:lineRule="auto"/>
       <w:jc w:val="left"/>
     </w:pPr>
     <w:rPr>
-      <w:rFonts w:ascii="Courier" w:hAnsi="Courier" w:eastAsia="" w:cs="" w:cstheme="minorBidi" w:eastAsiaTheme="minorEastAsia"/>
+      <w:rFonts w:ascii="Courier" w:hAnsi="Courier" w:eastAsia="" w:cs="" w:eastAsiaTheme="minorEastAsia" w:cstheme="minorBidi"/>
       <w:color w:val="auto"/>
       <w:kern w:val="0"/>
       <w:sz w:val="20"/>
@@ -3540,7 +3598,7 @@
     <w:rPr>
       <w:i/>
       <w:iCs/>
-      <w:color w:themeColor="text1" w:val="000000"/>
+      <w:color w:val="000000" w:themeColor="text1"/>
     </w:rPr>
   </w:style>
   <w:style w:type="paragraph" w:styleId="IntenseQuote">
@@ -3553,7 +3611,7 @@
     <w:rsid w:val="00fc693f"/>
     <w:pPr>
       <w:pBdr>
-        <w:bottom w:val="single" w:sz="4" w:space="4" w:color="4F81BD" w:themeColor="accent1"/>
+        <w:bottom w:val="single" w:color="4F81BD" w:themeColor="accent1" w:sz="4" w:space="4"/>
       </w:pBdr>
       <w:spacing w:before="200" w:after="280"/>
       <w:ind w:left="936" w:right="936"/>
@@ -3563,11 +3621,11 @@
       <w:bCs/>
       <w:i/>
       <w:iCs/>
-      <w:color w:themeColor="accent1" w:val="4F81BD"/>
+      <w:color w:val="4F81BD" w:themeColor="accent1"/>
     </w:rPr>
   </w:style>
   <w:style w:type="paragraph" w:styleId="IndexHeading">
-    <w:name w:val="Index Heading"/>
+    <w:name w:val="index heading"/>
     <w:basedOn w:val="Heading"/>
     <w:pPr/>
     <w:rPr/>
@@ -3593,7 +3651,7 @@
     <w:unhideWhenUsed/>
     <w:qFormat/>
   </w:style>
-  <w:style w:type="table" w:default="1" w:styleId="TableNormal">
+  <w:style w:type="table" w:styleId="TableNormal" w:default="1">
     <w:name w:val="Normal Table"/>
     <w:uiPriority w:val="99"/>
     <w:semiHidden/>

</xml_diff>